<commit_message>
Add ZIP export, row sequencing, and date/time UI
Enable ZIP output with change-ticket folders and improve form UX. Client: add createChangeTicketFolders flag and checkbox, generate .zip (or .docx) with safe filename and matching icon; enforce expectedEnd > expectedStart with dayjs helpers and disable invalid end dates/times; adjust layout/styling for preview column; show persistent seq (row.seq) in pipelines and dbScripts and display sequence in DB script cards. Composable: introduce renumberSeqForRows, initialize seq for pipelines/dbScripts and re-number on add/remove. Server: add zipChangeTicketBundle support and update generation logic to produce ZIP bundles. Dependencies: package.json/package-lock updated to include required archiving deps.
</commit_message>
<xml_diff>
--- a/server/template/template.docx
+++ b/server/template/template.docx
@@ -35,7 +35,7 @@
           <w:noProof/>
         </w:rPr>
         <w:drawing>
-          <wp:anchor distT="0" distB="0" distL="114300" distR="114300" simplePos="0" relativeHeight="251658240" behindDoc="1" locked="0" layoutInCell="1" allowOverlap="1" wp14:anchorId="55741B84" wp14:editId="1AA9CDC9">
+          <wp:anchor distT="0" distB="0" distL="114300" distR="114300" simplePos="0" relativeHeight="251658240" behindDoc="1" locked="0" layoutInCell="1" allowOverlap="1" wp14:anchorId="55741B84" wp14:editId="5303F328">
             <wp:simplePos x="0" y="0"/>
             <wp:positionH relativeFrom="margin">
               <wp:posOffset>5104130</wp:posOffset>
@@ -2518,10 +2518,11 @@
     <w:p>
       <w:pPr>
         <w:rPr>
-          <w:rFonts w:asciiTheme="minorHAnsi" w:hAnsiTheme="minorHAnsi" w:cstheme="minorHAnsi"/>
+          <w:rFonts w:asciiTheme="minorHAnsi" w:hAnsiTheme="minorHAnsi" w:cstheme="minorHAnsi" w:hint="eastAsia"/>
           <w:b/>
           <w:bCs/>
           <w:u w:val="single"/>
+          <w:lang w:eastAsia="zh-CN"/>
         </w:rPr>
       </w:pPr>
       <w:r>
@@ -3621,9 +3622,9 @@
         <w:tblLook w:val="04A0" w:firstRow="1" w:lastRow="0" w:firstColumn="1" w:lastColumn="0" w:noHBand="0" w:noVBand="1"/>
       </w:tblPr>
       <w:tblGrid>
-        <w:gridCol w:w="336"/>
-        <w:gridCol w:w="1579"/>
-        <w:gridCol w:w="3305"/>
+        <w:gridCol w:w="1984"/>
+        <w:gridCol w:w="1269"/>
+        <w:gridCol w:w="1967"/>
         <w:gridCol w:w="2264"/>
       </w:tblGrid>
       <w:tr>
@@ -3723,10 +3724,24 @@
             <w:pPr>
               <w:textAlignment w:val="baseline"/>
               <w:rPr>
-                <w:rFonts w:eastAsia="宋体"/>
+                <w:rFonts w:eastAsia="宋体" w:hint="eastAsia"/>
                 <w:lang w:eastAsia="zh-CN"/>
               </w:rPr>
             </w:pPr>
+            <w:r>
+              <w:t>{#</w:t>
+            </w:r>
+            <w:proofErr w:type="gramStart"/>
+            <w:r>
+              <w:t>pipelines}</w:t>
+            </w:r>
+            <w:r>
+              <w:t>{</w:t>
+            </w:r>
+            <w:proofErr w:type="gramEnd"/>
+            <w:r>
+              <w:t>seq}</w:t>
+            </w:r>
           </w:p>
         </w:tc>
         <w:tc>
@@ -3741,9 +3756,6 @@
                 <w:rFonts w:eastAsia="Times New Roman"/>
               </w:rPr>
             </w:pPr>
-            <w:r>
-              <w:t xml:space="preserve">{#pipelines} </w:t>
-            </w:r>
             <w:r>
               <w:t>{name}</w:t>
             </w:r>
@@ -4467,78 +4479,6 @@
     </w:tbl>
     <w:p>
       <w:pPr>
-        <w:textAlignment w:val="baseline"/>
-        <w:rPr>
-          <w:rFonts w:ascii="Segoe UI" w:eastAsia="Times New Roman" w:hAnsi="Segoe UI" w:cs="Segoe UI"/>
-          <w:sz w:val="18"/>
-          <w:szCs w:val="18"/>
-          <w:lang w:eastAsia="zh-CN"/>
-        </w:rPr>
-      </w:pPr>
-    </w:p>
-    <w:p>
-      <w:pPr>
-        <w:rPr>
-          <w:rFonts w:asciiTheme="minorHAnsi" w:hAnsiTheme="minorHAnsi" w:cstheme="minorHAnsi"/>
-          <w:i/>
-          <w:iCs/>
-          <w:sz w:val="16"/>
-          <w:szCs w:val="16"/>
-        </w:rPr>
-      </w:pPr>
-      <w:bookmarkStart w:id="4" w:name="OLE_LINK48"/>
-      <w:r>
-        <w:t>{#staticFiles}</w:t>
-      </w:r>
-      <w:bookmarkEnd w:id="4"/>
-      <w:r>
-        <w:t xml:space="preserve"> </w:t>
-      </w:r>
-      <w:bookmarkStart w:id="5" w:name="OLE_LINK51"/>
-      <w:r>
-        <w:t xml:space="preserve">{type} </w:t>
-      </w:r>
-      <w:bookmarkStart w:id="6" w:name="OLE_LINK52"/>
-      <w:bookmarkEnd w:id="5"/>
-      <w:r>
-        <w:t>{</w:t>
-      </w:r>
-      <w:proofErr w:type="spellStart"/>
-      <w:r>
-        <w:t>sourcePath</w:t>
-      </w:r>
-      <w:proofErr w:type="spellEnd"/>
-      <w:r>
-        <w:t>} {</w:t>
-      </w:r>
-      <w:proofErr w:type="spellStart"/>
-      <w:r>
-        <w:t>destPath</w:t>
-      </w:r>
-      <w:proofErr w:type="spellEnd"/>
-      <w:r>
-        <w:t>}</w:t>
-      </w:r>
-      <w:bookmarkEnd w:id="6"/>
-      <w:r>
-        <w:t xml:space="preserve"> </w:t>
-      </w:r>
-      <w:bookmarkStart w:id="7" w:name="OLE_LINK53"/>
-      <w:r>
-        <w:t>{/</w:t>
-      </w:r>
-      <w:proofErr w:type="spellStart"/>
-      <w:r>
-        <w:t>staticFiles</w:t>
-      </w:r>
-      <w:proofErr w:type="spellEnd"/>
-      <w:r>
-        <w:t>}</w:t>
-      </w:r>
-      <w:bookmarkEnd w:id="7"/>
-    </w:p>
-    <w:p>
-      <w:pPr>
         <w:rPr>
           <w:rFonts w:asciiTheme="minorHAnsi" w:eastAsia="宋体" w:hAnsiTheme="minorHAnsi" w:cstheme="minorHAnsi"/>
           <w:i/>
@@ -4791,13 +4731,13 @@
         <w:tblLook w:val="04A0" w:firstRow="1" w:lastRow="0" w:firstColumn="1" w:lastColumn="0" w:noHBand="0" w:noVBand="1"/>
       </w:tblPr>
       <w:tblGrid>
-        <w:gridCol w:w="661"/>
-        <w:gridCol w:w="1787"/>
-        <w:gridCol w:w="873"/>
-        <w:gridCol w:w="1157"/>
-        <w:gridCol w:w="508"/>
-        <w:gridCol w:w="1453"/>
-        <w:gridCol w:w="2243"/>
+        <w:gridCol w:w="2091"/>
+        <w:gridCol w:w="677"/>
+        <w:gridCol w:w="828"/>
+        <w:gridCol w:w="1098"/>
+        <w:gridCol w:w="482"/>
+        <w:gridCol w:w="1379"/>
+        <w:gridCol w:w="2127"/>
       </w:tblGrid>
       <w:tr>
         <w:trPr>
@@ -5075,20 +5015,32 @@
             <w:pPr>
               <w:ind w:left="720"/>
               <w:rPr>
+                <w:rFonts w:asciiTheme="minorHAnsi" w:eastAsia="宋体" w:hAnsiTheme="minorHAnsi" w:cstheme="minorHAnsi" w:hint="eastAsia"/>
+                <w:sz w:val="16"/>
+                <w:szCs w:val="16"/>
+                <w:lang w:eastAsia="zh-CN"/>
+              </w:rPr>
+            </w:pPr>
+            <w:r>
+              <w:t>{#dbScripts}</w:t>
+            </w:r>
+            <w:r>
+              <w:rPr>
                 <w:rFonts w:asciiTheme="minorHAnsi" w:eastAsia="宋体" w:hAnsiTheme="minorHAnsi" w:cstheme="minorHAnsi"/>
                 <w:sz w:val="16"/>
                 <w:szCs w:val="16"/>
                 <w:lang w:eastAsia="zh-CN"/>
               </w:rPr>
-            </w:pPr>
-            <w:r>
-              <w:rPr>
-                <w:rFonts w:asciiTheme="minorHAnsi" w:eastAsia="宋体" w:hAnsiTheme="minorHAnsi" w:cstheme="minorHAnsi"/>
-                <w:sz w:val="16"/>
-                <w:szCs w:val="16"/>
-                <w:lang w:eastAsia="zh-CN"/>
-              </w:rPr>
               <w:t> </w:t>
+            </w:r>
+            <w:r>
+              <w:t>{se</w:t>
+            </w:r>
+            <w:r>
+              <w:t>q</w:t>
+            </w:r>
+            <w:r>
+              <w:t>}</w:t>
             </w:r>
           </w:p>
         </w:tc>
@@ -5112,20 +5064,11 @@
                 <w:lang w:eastAsia="zh-CN"/>
               </w:rPr>
             </w:pPr>
-            <w:r>
-              <w:t>{#</w:t>
-            </w:r>
-            <w:proofErr w:type="gramStart"/>
-            <w:r>
-              <w:t>dbScripts}</w:t>
-            </w:r>
-            <w:r>
-              <w:t>{</w:t>
-            </w:r>
-            <w:proofErr w:type="gramEnd"/>
-            <w:r>
-              <w:t>server}</w:t>
-            </w:r>
+            <w:bookmarkStart w:id="4" w:name="OLE_LINK6"/>
+            <w:r>
+              <w:t>{server}</w:t>
+            </w:r>
+            <w:bookmarkEnd w:id="4"/>
           </w:p>
         </w:tc>
         <w:tc>
@@ -5984,7 +5927,7 @@
         </w:rPr>
         <w:t>jiraAaApi</w:t>
       </w:r>
-      <w:bookmarkStart w:id="8" w:name="OLE_LINK19"/>
+      <w:bookmarkStart w:id="5" w:name="OLE_LINK19"/>
       <w:r>
         <w:rPr>
           <w:rFonts w:eastAsia="宋体"/>
@@ -5995,7 +5938,7 @@
         </w:rPr>
         <w:t>RollBack</w:t>
       </w:r>
-      <w:bookmarkEnd w:id="8"/>
+      <w:bookmarkEnd w:id="5"/>
       <w:proofErr w:type="spellEnd"/>
       <w:r>
         <w:rPr>
@@ -9244,6 +9187,7 @@
     <w:rsid w:val="006F225F"/>
     <w:rsid w:val="006F22F3"/>
     <w:rsid w:val="006F6D01"/>
+    <w:rsid w:val="007132E4"/>
     <w:rsid w:val="00721AE1"/>
     <w:rsid w:val="0072680D"/>
     <w:rsid w:val="0073784C"/>
@@ -10118,15 +10062,6 @@
 </file>
 
 <file path=customXml/item1.xml><?xml version="1.0" encoding="utf-8"?>
-<?mso-contentType ?>
-<FormTemplates xmlns="http://schemas.microsoft.com/sharepoint/v3/contenttype/forms">
-  <Display>DocumentLibraryForm</Display>
-  <Edit>DocumentLibraryForm</Edit>
-  <New>DocumentLibraryForm</New>
-</FormTemplates>
-</file>
-
-<file path=customXml/item2.xml><?xml version="1.0" encoding="utf-8"?>
 <p:properties xmlns:p="http://schemas.microsoft.com/office/2006/metadata/properties" xmlns:xsi="http://www.w3.org/2001/XMLSchema-instance">
   <documentManagement>
     <lcf76f155ced4ddcb4097134ff3c332f xmlns="1b4d0333-1b33-414c-b04a-1d69857a46e0">
@@ -10137,11 +10072,16 @@
 </p:properties>
 </file>
 
-<file path=customXml/item3.xml><?xml version="1.0" encoding="utf-8"?>
-<b:Sources xmlns:b="http://schemas.openxmlformats.org/officeDocument/2006/bibliography" xmlns="http://schemas.openxmlformats.org/officeDocument/2006/bibliography" SelectedStyle="\APA.XSL" StyleName="APA Fifth Edition"/>
+<file path=customXml/item2.xml><?xml version="1.0" encoding="utf-8"?>
+<?mso-contentType ?>
+<FormTemplates xmlns="http://schemas.microsoft.com/sharepoint/v3/contenttype/forms">
+  <Display>DocumentLibraryForm</Display>
+  <Edit>DocumentLibraryForm</Edit>
+  <New>DocumentLibraryForm</New>
+</FormTemplates>
 </file>
 
-<file path=customXml/item4.xml><?xml version="1.0" encoding="utf-8"?>
+<file path=customXml/item3.xml><?xml version="1.0" encoding="utf-8"?>
 <ct:contentTypeSchema xmlns:ct="http://schemas.microsoft.com/office/2006/metadata/contentType" xmlns:ma="http://schemas.microsoft.com/office/2006/metadata/properties/metaAttributes" ct:_="" ma:_="" ma:contentTypeName="Document" ma:contentTypeID="0x010100ABCDA13995A9524982B937E00F80E6E0" ma:contentTypeVersion="11" ma:contentTypeDescription="Create a new document." ma:contentTypeScope="" ma:versionID="4f6be1ed2e285541239abc9f913cda14">
   <xsd:schema xmlns:xsd="http://www.w3.org/2001/XMLSchema" xmlns:xs="http://www.w3.org/2001/XMLSchema" xmlns:p="http://schemas.microsoft.com/office/2006/metadata/properties" xmlns:ns2="1b4d0333-1b33-414c-b04a-1d69857a46e0" xmlns:ns3="0dfa6105-4e03-4582-a5b6-d40922f3c820" targetNamespace="http://schemas.microsoft.com/office/2006/metadata/properties" ma:root="true" ma:fieldsID="7792a18696d3e888f0fab05b54f3e11f" ns2:_="" ns3:_="">
     <xsd:import namespace="1b4d0333-1b33-414c-b04a-1d69857a46e0"/>
@@ -10336,15 +10276,11 @@
 </ct:contentTypeSchema>
 </file>
 
-<file path=customXml/itemProps1.xml><?xml version="1.0" encoding="utf-8"?>
-<ds:datastoreItem xmlns:ds="http://schemas.openxmlformats.org/officeDocument/2006/customXml" ds:itemID="{38272512-EDBD-44DE-BD38-00BAB3D04656}">
-  <ds:schemaRefs>
-    <ds:schemaRef ds:uri="http://schemas.microsoft.com/sharepoint/v3/contenttype/forms"/>
-  </ds:schemaRefs>
-</ds:datastoreItem>
+<file path=customXml/item4.xml><?xml version="1.0" encoding="utf-8"?>
+<b:Sources xmlns:b="http://schemas.openxmlformats.org/officeDocument/2006/bibliography" xmlns="http://schemas.openxmlformats.org/officeDocument/2006/bibliography" SelectedStyle="\APA.XSL" StyleName="APA Fifth Edition"/>
 </file>
 
-<file path=customXml/itemProps2.xml><?xml version="1.0" encoding="utf-8"?>
+<file path=customXml/itemProps1.xml><?xml version="1.0" encoding="utf-8"?>
 <ds:datastoreItem xmlns:ds="http://schemas.openxmlformats.org/officeDocument/2006/customXml" ds:itemID="{1FFB5C50-97DC-4C4E-BA6F-D6A1D523E164}">
   <ds:schemaRefs>
     <ds:schemaRef ds:uri="http://schemas.microsoft.com/office/2006/metadata/properties"/>
@@ -10355,15 +10291,15 @@
 </ds:datastoreItem>
 </file>
 
-<file path=customXml/itemProps3.xml><?xml version="1.0" encoding="utf-8"?>
-<ds:datastoreItem xmlns:ds="http://schemas.openxmlformats.org/officeDocument/2006/customXml" ds:itemID="{F0BBAED5-B99B-4F2F-91D0-906FF495A8D2}">
+<file path=customXml/itemProps2.xml><?xml version="1.0" encoding="utf-8"?>
+<ds:datastoreItem xmlns:ds="http://schemas.openxmlformats.org/officeDocument/2006/customXml" ds:itemID="{38272512-EDBD-44DE-BD38-00BAB3D04656}">
   <ds:schemaRefs>
-    <ds:schemaRef ds:uri="http://schemas.openxmlformats.org/officeDocument/2006/bibliography"/>
+    <ds:schemaRef ds:uri="http://schemas.microsoft.com/sharepoint/v3/contenttype/forms"/>
   </ds:schemaRefs>
 </ds:datastoreItem>
 </file>
 
-<file path=customXml/itemProps4.xml><?xml version="1.0" encoding="utf-8"?>
+<file path=customXml/itemProps3.xml><?xml version="1.0" encoding="utf-8"?>
 <ds:datastoreItem xmlns:ds="http://schemas.openxmlformats.org/officeDocument/2006/customXml" ds:itemID="{EFA809F1-573C-4050-A95C-9416DD01CC60}">
   <ds:schemaRefs>
     <ds:schemaRef ds:uri="http://schemas.microsoft.com/office/2006/metadata/contentType"/>
@@ -10380,4 +10316,12 @@
     <ds:schemaRef ds:uri="http://schemas.microsoft.com/internal/obd"/>
   </ds:schemaRefs>
 </ds:datastoreItem>
+</file>
+
+<file path=customXml/itemProps4.xml><?xml version="1.0" encoding="utf-8"?>
+<ds:datastoreItem xmlns:ds="http://schemas.openxmlformats.org/officeDocument/2006/customXml" ds:itemID="{F0BBAED5-B99B-4F2F-91D0-906FF495A8D2}">
+  <ds:schemaRefs>
+    <ds:schemaRef ds:uri="http://schemas.openxmlformats.org/officeDocument/2006/bibliography"/>
+  </ds:schemaRefs>
+</ds:datastoreItem>
 </file>
</xml_diff>

<commit_message>
Add estimation total calculation to PTF generator
Extracts numeric values from step Estimation fields and computes a Grand Total for use in the Word template. Adds parseEstimationToNumber to parse the first continuous number (returns 0 if none), collects deploymentRows once, and computes estimationGrandTotal and estimationGrandTotalDisplay (rounded to 2 decimals when needed). Updates template.docx to consume the new fields.
</commit_message>
<xml_diff>
--- a/server/template/template.docx
+++ b/server/template/template.docx
@@ -6,11 +6,9 @@
       <w:pPr>
         <w:jc w:val="both"/>
         <w:rPr>
-          <w:rFonts w:eastAsia="宋体"/>
           <w:b/>
           <w:sz w:val="40"/>
           <w:szCs w:val="40"/>
-          <w:lang w:eastAsia="zh-CN"/>
         </w:rPr>
       </w:pPr>
     </w:p>
@@ -35,7 +33,7 @@
           <w:noProof/>
         </w:rPr>
         <w:drawing>
-          <wp:anchor distT="0" distB="0" distL="114300" distR="114300" simplePos="0" relativeHeight="251658240" behindDoc="1" locked="0" layoutInCell="1" allowOverlap="1" wp14:anchorId="55741B84" wp14:editId="5303F328">
+          <wp:anchor distT="0" distB="0" distL="114300" distR="114300" simplePos="0" relativeHeight="251658240" behindDoc="1" locked="0" layoutInCell="1" allowOverlap="1" wp14:anchorId="55741B84" wp14:editId="5A531133">
             <wp:simplePos x="0" y="0"/>
             <wp:positionH relativeFrom="margin">
               <wp:posOffset>5104130</wp:posOffset>
@@ -112,7 +110,6 @@
           <w:rFonts w:asciiTheme="minorHAnsi" w:hAnsiTheme="minorHAnsi" w:cstheme="minorHAnsi"/>
           <w:sz w:val="28"/>
           <w:szCs w:val="28"/>
-          <w:lang w:eastAsia="zh-CN"/>
         </w:rPr>
       </w:pPr>
       <w:r>
@@ -120,7 +117,6 @@
           <w:rFonts w:asciiTheme="minorHAnsi" w:hAnsiTheme="minorHAnsi" w:cstheme="minorHAnsi"/>
           <w:sz w:val="28"/>
           <w:szCs w:val="28"/>
-          <w:lang w:eastAsia="zh-CN"/>
         </w:rPr>
         <w:t>{</w:t>
       </w:r>
@@ -130,7 +126,6 @@
           <w:rFonts w:asciiTheme="minorHAnsi" w:hAnsiTheme="minorHAnsi" w:cstheme="minorHAnsi"/>
           <w:sz w:val="28"/>
           <w:szCs w:val="28"/>
-          <w:lang w:eastAsia="zh-CN"/>
         </w:rPr>
         <w:t>enviromentLine</w:t>
       </w:r>
@@ -140,7 +135,6 @@
           <w:rFonts w:asciiTheme="minorHAnsi" w:hAnsiTheme="minorHAnsi" w:cstheme="minorHAnsi"/>
           <w:sz w:val="28"/>
           <w:szCs w:val="28"/>
-          <w:lang w:eastAsia="zh-CN"/>
         </w:rPr>
         <w:t>}</w:t>
       </w:r>
@@ -149,7 +143,6 @@
           <w:rFonts w:asciiTheme="minorHAnsi" w:hAnsiTheme="minorHAnsi" w:cstheme="minorHAnsi"/>
           <w:sz w:val="28"/>
           <w:szCs w:val="28"/>
-          <w:lang w:eastAsia="zh-CN"/>
         </w:rPr>
         <w:t xml:space="preserve"> &lt;Click one box only&gt;</w:t>
       </w:r>
@@ -370,11 +363,6 @@
             <w:tcW w:w="2662" w:type="dxa"/>
           </w:tcPr>
           <w:p>
-            <w:pPr>
-              <w:rPr>
-                <w:lang w:eastAsia="zh-CN"/>
-              </w:rPr>
-            </w:pPr>
             <w:r>
               <w:t>{</w:t>
             </w:r>
@@ -474,19 +462,10 @@
             </w:r>
             <w:proofErr w:type="spellStart"/>
             <w:r>
-              <w:t>expectedStart</w:t>
-            </w:r>
-            <w:r>
-              <w:rPr>
-                <w:lang w:eastAsia="zh-CN"/>
-              </w:rPr>
-              <w:t>Time</w:t>
+              <w:t>expectedStartTime</w:t>
             </w:r>
             <w:proofErr w:type="spellEnd"/>
             <w:r>
-              <w:rPr>
-                <w:lang w:eastAsia="zh-CN"/>
-              </w:rPr>
               <w:t>}</w:t>
             </w:r>
           </w:p>
@@ -936,23 +915,14 @@
           </w:tcPr>
           <w:p>
             <w:r>
-              <w:rPr>
-                <w:lang w:eastAsia="zh-CN"/>
-              </w:rPr>
               <w:t>{</w:t>
             </w:r>
             <w:proofErr w:type="spellStart"/>
             <w:r>
-              <w:rPr>
-                <w:lang w:eastAsia="zh-CN"/>
-              </w:rPr>
               <w:t>teamLead</w:t>
             </w:r>
             <w:proofErr w:type="spellEnd"/>
             <w:r>
-              <w:rPr>
-                <w:lang w:eastAsia="zh-CN"/>
-              </w:rPr>
               <w:t>}</w:t>
             </w:r>
             <w:r>
@@ -2518,11 +2488,10 @@
     <w:p>
       <w:pPr>
         <w:rPr>
-          <w:rFonts w:asciiTheme="minorHAnsi" w:hAnsiTheme="minorHAnsi" w:cstheme="minorHAnsi" w:hint="eastAsia"/>
+          <w:rFonts w:asciiTheme="minorHAnsi" w:hAnsiTheme="minorHAnsi" w:cstheme="minorHAnsi"/>
           <w:b/>
           <w:bCs/>
           <w:u w:val="single"/>
-          <w:lang w:eastAsia="zh-CN"/>
         </w:rPr>
       </w:pPr>
       <w:r>
@@ -2771,19 +2740,17 @@
           <w:p>
             <w:pPr>
               <w:rPr>
-                <w:rFonts w:asciiTheme="majorHAnsi" w:eastAsia="宋体" w:hAnsiTheme="majorHAnsi" w:cstheme="minorHAnsi"/>
+                <w:rFonts w:asciiTheme="majorHAnsi" w:hAnsiTheme="majorHAnsi" w:cstheme="minorHAnsi"/>
                 <w:sz w:val="16"/>
                 <w:szCs w:val="16"/>
-                <w:lang w:eastAsia="zh-CN"/>
               </w:rPr>
             </w:pPr>
             <w:bookmarkStart w:id="1" w:name="OLE_LINK30"/>
             <w:r>
               <w:rPr>
-                <w:rFonts w:asciiTheme="majorHAnsi" w:eastAsia="宋体" w:hAnsiTheme="majorHAnsi" w:cstheme="minorHAnsi"/>
+                <w:rFonts w:asciiTheme="majorHAnsi" w:hAnsiTheme="majorHAnsi" w:cstheme="minorHAnsi"/>
                 <w:sz w:val="16"/>
                 <w:szCs w:val="16"/>
-                <w:lang w:eastAsia="zh-CN"/>
               </w:rPr>
               <w:t>{</w:t>
             </w:r>
@@ -2806,10 +2773,9 @@
             </w:r>
             <w:r>
               <w:rPr>
-                <w:rFonts w:asciiTheme="majorHAnsi" w:eastAsia="宋体" w:hAnsiTheme="majorHAnsi" w:cstheme="minorHAnsi"/>
+                <w:rFonts w:asciiTheme="majorHAnsi" w:hAnsiTheme="majorHAnsi" w:cstheme="minorHAnsi"/>
                 <w:sz w:val="16"/>
                 <w:szCs w:val="16"/>
-                <w:lang w:eastAsia="zh-CN"/>
               </w:rPr>
               <w:t xml:space="preserve"> }</w:t>
             </w:r>
@@ -2832,13 +2798,12 @@
           <w:p>
             <w:pPr>
               <w:rPr>
-                <w:rFonts w:asciiTheme="minorHAnsi" w:eastAsia="宋体" w:hAnsiTheme="minorHAnsi" w:cstheme="minorHAnsi"/>
+                <w:rFonts w:asciiTheme="minorHAnsi" w:hAnsiTheme="minorHAnsi" w:cstheme="minorHAnsi"/>
                 <w:i/>
                 <w:iCs/>
                 <w:color w:val="000000" w:themeColor="text1"/>
                 <w:sz w:val="16"/>
                 <w:szCs w:val="16"/>
-                <w:lang w:eastAsia="zh-CN"/>
               </w:rPr>
             </w:pPr>
             <w:r>
@@ -2901,11 +2866,10 @@
           <w:p>
             <w:pPr>
               <w:rPr>
-                <w:rFonts w:asciiTheme="minorHAnsi" w:eastAsia="宋体" w:hAnsiTheme="minorHAnsi" w:cstheme="minorHAnsi"/>
+                <w:rFonts w:asciiTheme="minorHAnsi" w:hAnsiTheme="minorHAnsi" w:cstheme="minorHAnsi"/>
                 <w:color w:val="000000" w:themeColor="text1"/>
                 <w:sz w:val="16"/>
                 <w:szCs w:val="16"/>
-                <w:lang w:eastAsia="zh-CN"/>
               </w:rPr>
             </w:pPr>
             <w:r>
@@ -2957,7 +2921,25 @@
                 <w:sz w:val="16"/>
                 <w:szCs w:val="16"/>
               </w:rPr>
-              <w:t>{estimation}</w:t>
+              <w:t>{</w:t>
+            </w:r>
+            <w:bookmarkStart w:id="3" w:name="OLE_LINK3"/>
+            <w:r>
+              <w:rPr>
+                <w:rFonts w:asciiTheme="majorHAnsi" w:hAnsiTheme="majorHAnsi"/>
+                <w:sz w:val="16"/>
+                <w:szCs w:val="16"/>
+              </w:rPr>
+              <w:t>estimation</w:t>
+            </w:r>
+            <w:bookmarkEnd w:id="3"/>
+            <w:r>
+              <w:rPr>
+                <w:rFonts w:asciiTheme="majorHAnsi" w:hAnsiTheme="majorHAnsi"/>
+                <w:sz w:val="16"/>
+                <w:szCs w:val="16"/>
+              </w:rPr>
+              <w:t>}</w:t>
             </w:r>
             <w:r>
               <w:rPr>
@@ -3085,14 +3067,37 @@
           <w:p>
             <w:pPr>
               <w:rPr>
-                <w:rFonts w:asciiTheme="minorHAnsi" w:eastAsia="宋体" w:hAnsiTheme="minorHAnsi" w:cstheme="minorHAnsi"/>
-                <w:i/>
-                <w:iCs/>
+                <w:rFonts w:asciiTheme="majorHAnsi" w:hAnsiTheme="majorHAnsi"/>
                 <w:sz w:val="16"/>
                 <w:szCs w:val="16"/>
-                <w:lang w:eastAsia="zh-CN"/>
               </w:rPr>
             </w:pPr>
+            <w:r>
+              <w:rPr>
+                <w:rFonts w:asciiTheme="majorHAnsi" w:hAnsiTheme="majorHAnsi"/>
+                <w:sz w:val="16"/>
+                <w:szCs w:val="16"/>
+              </w:rPr>
+              <w:t>{</w:t>
+            </w:r>
+            <w:proofErr w:type="spellStart"/>
+            <w:r>
+              <w:rPr>
+                <w:rFonts w:asciiTheme="majorHAnsi" w:hAnsiTheme="majorHAnsi"/>
+                <w:sz w:val="16"/>
+                <w:szCs w:val="16"/>
+              </w:rPr>
+              <w:t>estimationGrandTotal</w:t>
+            </w:r>
+            <w:proofErr w:type="spellEnd"/>
+            <w:r>
+              <w:rPr>
+                <w:rFonts w:asciiTheme="majorHAnsi" w:hAnsiTheme="majorHAnsi"/>
+                <w:sz w:val="16"/>
+                <w:szCs w:val="16"/>
+              </w:rPr>
+              <w:t>}</w:t>
+            </w:r>
           </w:p>
         </w:tc>
       </w:tr>
@@ -3396,12 +3401,11 @@
     <w:p>
       <w:pPr>
         <w:rPr>
-          <w:rFonts w:asciiTheme="minorHAnsi" w:eastAsia="宋体" w:hAnsiTheme="minorHAnsi" w:cstheme="minorHAnsi"/>
+          <w:rFonts w:asciiTheme="minorHAnsi" w:hAnsiTheme="minorHAnsi" w:cstheme="minorHAnsi"/>
           <w:i/>
           <w:iCs/>
           <w:sz w:val="16"/>
           <w:szCs w:val="16"/>
-          <w:lang w:eastAsia="zh-CN"/>
         </w:rPr>
       </w:pPr>
     </w:p>
@@ -3458,7 +3462,7 @@
           <w:rFonts w:asciiTheme="minorHAnsi" w:hAnsiTheme="minorHAnsi"/>
           <w:sz w:val="22"/>
           <w:szCs w:val="22"/>
-          <w:lang w:val="en-GB" w:eastAsia="zh-CN"/>
+          <w:lang w:val="en-GB"/>
         </w:rPr>
       </w:pPr>
       <w:r>
@@ -3466,7 +3470,7 @@
           <w:rFonts w:asciiTheme="minorHAnsi" w:hAnsiTheme="minorHAnsi"/>
           <w:sz w:val="22"/>
           <w:szCs w:val="22"/>
-          <w:lang w:val="en-GB" w:eastAsia="zh-CN"/>
+          <w:lang w:val="en-GB"/>
         </w:rPr>
         <w:t>Contact point:</w:t>
       </w:r>
@@ -3478,7 +3482,7 @@
           <w:rFonts w:ascii="Calibri" w:eastAsia="Times New Roman" w:hAnsi="Calibri" w:cs="Calibri"/>
           <w:sz w:val="22"/>
           <w:szCs w:val="22"/>
-          <w:lang w:val="en-GB" w:eastAsia="zh-CN"/>
+          <w:lang w:val="en-GB"/>
         </w:rPr>
       </w:pPr>
       <w:r>
@@ -3486,7 +3490,7 @@
           <w:rFonts w:ascii="Calibri" w:eastAsia="Times New Roman" w:hAnsi="Calibri" w:cs="Calibri"/>
           <w:sz w:val="22"/>
           <w:szCs w:val="22"/>
-          <w:lang w:val="en-GB" w:eastAsia="zh-CN"/>
+          <w:lang w:val="en-GB"/>
         </w:rPr>
         <w:t>{</w:t>
       </w:r>
@@ -3496,7 +3500,7 @@
           <w:rFonts w:ascii="Calibri" w:eastAsia="Times New Roman" w:hAnsi="Calibri" w:cs="Calibri"/>
           <w:sz w:val="22"/>
           <w:szCs w:val="22"/>
-          <w:lang w:val="en-GB" w:eastAsia="zh-CN"/>
+          <w:lang w:val="en-GB"/>
         </w:rPr>
         <w:t>contactsWintel</w:t>
       </w:r>
@@ -3506,7 +3510,7 @@
           <w:rFonts w:ascii="Calibri" w:eastAsia="Times New Roman" w:hAnsi="Calibri" w:cs="Calibri"/>
           <w:sz w:val="22"/>
           <w:szCs w:val="22"/>
-          <w:lang w:val="en-GB" w:eastAsia="zh-CN"/>
+          <w:lang w:val="en-GB"/>
         </w:rPr>
         <w:t>}</w:t>
       </w:r>
@@ -3514,10 +3518,9 @@
     <w:p>
       <w:pPr>
         <w:rPr>
-          <w:rFonts w:ascii="Calibri" w:eastAsia="宋体" w:hAnsi="Calibri" w:cs="Calibri"/>
+          <w:rFonts w:ascii="Calibri" w:hAnsi="Calibri" w:cs="Calibri"/>
           <w:sz w:val="22"/>
           <w:szCs w:val="22"/>
-          <w:lang w:eastAsia="zh-CN"/>
         </w:rPr>
       </w:pPr>
     </w:p>
@@ -3568,10 +3571,6 @@
     <w:p>
       <w:pPr>
         <w:textAlignment w:val="baseline"/>
-        <w:rPr>
-          <w:rFonts w:eastAsia="宋体"/>
-          <w:lang w:eastAsia="zh-CN"/>
-        </w:rPr>
       </w:pPr>
       <w:r>
         <w:rPr>
@@ -3583,10 +3582,6 @@
     <w:p>
       <w:pPr>
         <w:textAlignment w:val="baseline"/>
-        <w:rPr>
-          <w:rFonts w:eastAsia="宋体"/>
-          <w:lang w:eastAsia="zh-CN"/>
-        </w:rPr>
       </w:pPr>
     </w:p>
     <w:p>
@@ -3608,8 +3603,7 @@
       </w:r>
       <w:r>
         <w:rPr>
-          <w:rFonts w:eastAsia="宋体" w:hint="eastAsia"/>
-          <w:lang w:eastAsia="zh-CN"/>
+          <w:rFonts w:hint="eastAsia"/>
         </w:rPr>
         <w:t xml:space="preserve"> </w:t>
       </w:r>
@@ -3622,10 +3616,10 @@
         <w:tblLook w:val="04A0" w:firstRow="1" w:lastRow="0" w:firstColumn="1" w:lastColumn="0" w:noHBand="0" w:noVBand="1"/>
       </w:tblPr>
       <w:tblGrid>
-        <w:gridCol w:w="1984"/>
-        <w:gridCol w:w="1269"/>
-        <w:gridCol w:w="1967"/>
-        <w:gridCol w:w="2264"/>
+        <w:gridCol w:w="2256"/>
+        <w:gridCol w:w="1231"/>
+        <w:gridCol w:w="1261"/>
+        <w:gridCol w:w="2736"/>
       </w:tblGrid>
       <w:tr>
         <w:tc>
@@ -3635,15 +3629,10 @@
           <w:p>
             <w:pPr>
               <w:textAlignment w:val="baseline"/>
-              <w:rPr>
-                <w:rFonts w:eastAsia="宋体"/>
-                <w:lang w:eastAsia="zh-CN"/>
-              </w:rPr>
             </w:pPr>
             <w:r>
               <w:rPr>
-                <w:rFonts w:eastAsia="宋体" w:hint="eastAsia"/>
-                <w:lang w:eastAsia="zh-CN"/>
+                <w:rFonts w:hint="eastAsia"/>
               </w:rPr>
               <w:t>#</w:t>
             </w:r>
@@ -3656,15 +3645,10 @@
           <w:p>
             <w:pPr>
               <w:textAlignment w:val="baseline"/>
-              <w:rPr>
-                <w:rFonts w:eastAsia="宋体"/>
-                <w:lang w:eastAsia="zh-CN"/>
-              </w:rPr>
             </w:pPr>
             <w:r>
               <w:rPr>
-                <w:rFonts w:eastAsia="宋体" w:hint="eastAsia"/>
-                <w:lang w:eastAsia="zh-CN"/>
+                <w:rFonts w:hint="eastAsia"/>
               </w:rPr>
               <w:t>Pipeline Name</w:t>
             </w:r>
@@ -3678,15 +3662,10 @@
             <w:pPr>
               <w:jc w:val="both"/>
               <w:textAlignment w:val="baseline"/>
-              <w:rPr>
-                <w:rFonts w:eastAsia="宋体"/>
-                <w:lang w:eastAsia="zh-CN"/>
-              </w:rPr>
             </w:pPr>
             <w:r>
               <w:rPr>
-                <w:rFonts w:eastAsia="宋体" w:hint="eastAsia"/>
-                <w:lang w:eastAsia="zh-CN"/>
+                <w:rFonts w:hint="eastAsia"/>
               </w:rPr>
               <w:t>Link</w:t>
             </w:r>
@@ -3700,15 +3679,10 @@
             <w:pPr>
               <w:jc w:val="both"/>
               <w:textAlignment w:val="baseline"/>
-              <w:rPr>
-                <w:rFonts w:eastAsia="宋体"/>
-                <w:lang w:eastAsia="zh-CN"/>
-              </w:rPr>
             </w:pPr>
             <w:r>
               <w:rPr>
-                <w:rFonts w:eastAsia="宋体" w:hint="eastAsia"/>
-                <w:lang w:eastAsia="zh-CN"/>
+                <w:rFonts w:hint="eastAsia"/>
               </w:rPr>
               <w:t>ITSR/INC/PRB</w:t>
             </w:r>
@@ -3723,10 +3697,6 @@
           <w:p>
             <w:pPr>
               <w:textAlignment w:val="baseline"/>
-              <w:rPr>
-                <w:rFonts w:eastAsia="宋体" w:hint="eastAsia"/>
-                <w:lang w:eastAsia="zh-CN"/>
-              </w:rPr>
             </w:pPr>
             <w:r>
               <w:t>{#</w:t>
@@ -3832,30 +3802,20 @@
         <w:t xml:space="preserve">on </w:t>
       </w:r>
       <w:r>
-        <w:rPr>
-          <w:rFonts w:eastAsia="宋体"/>
-          <w:lang w:eastAsia="zh-CN"/>
-        </w:rPr>
         <w:t>“</w:t>
       </w:r>
       <w:r>
         <w:rPr>
-          <w:rFonts w:eastAsia="宋体" w:hint="eastAsia"/>
-          <w:lang w:eastAsia="zh-CN"/>
+          <w:rFonts w:hint="eastAsia"/>
         </w:rPr>
         <w:t>Ready to Deploy PRD</w:t>
       </w:r>
       <w:r>
-        <w:rPr>
-          <w:rFonts w:eastAsia="宋体"/>
-          <w:lang w:eastAsia="zh-CN"/>
-        </w:rPr>
         <w:t>”</w:t>
       </w:r>
       <w:r>
         <w:rPr>
-          <w:rFonts w:eastAsia="宋体" w:hint="eastAsia"/>
-          <w:lang w:eastAsia="zh-CN"/>
+          <w:rFonts w:hint="eastAsia"/>
         </w:rPr>
         <w:t xml:space="preserve"> =&gt; </w:t>
       </w:r>
@@ -3973,31 +3933,25 @@
     <w:p>
       <w:pPr>
         <w:textAlignment w:val="baseline"/>
-        <w:rPr>
-          <w:rFonts w:eastAsia="宋体"/>
-          <w:lang w:eastAsia="zh-CN"/>
-        </w:rPr>
       </w:pPr>
     </w:p>
     <w:p>
       <w:pPr>
         <w:rPr>
-          <w:rFonts w:asciiTheme="minorHAnsi" w:eastAsia="宋体" w:hAnsiTheme="minorHAnsi" w:cstheme="minorHAnsi"/>
+          <w:rFonts w:asciiTheme="minorHAnsi" w:hAnsiTheme="minorHAnsi" w:cstheme="minorHAnsi"/>
           <w:i/>
           <w:iCs/>
           <w:sz w:val="16"/>
           <w:szCs w:val="16"/>
-          <w:lang w:eastAsia="zh-CN"/>
-        </w:rPr>
-      </w:pPr>
-      <w:r>
-        <w:rPr>
-          <w:rFonts w:asciiTheme="minorHAnsi" w:eastAsia="宋体" w:hAnsiTheme="minorHAnsi" w:cstheme="minorHAnsi"/>
+        </w:rPr>
+      </w:pPr>
+      <w:r>
+        <w:rPr>
+          <w:rFonts w:asciiTheme="minorHAnsi" w:hAnsiTheme="minorHAnsi" w:cstheme="minorHAnsi"/>
           <w:i/>
           <w:iCs/>
           <w:sz w:val="16"/>
           <w:szCs w:val="16"/>
-          <w:lang w:eastAsia="zh-CN"/>
         </w:rPr>
         <w:t>  </w:t>
       </w:r>
@@ -4005,12 +3959,11 @@
     <w:p>
       <w:pPr>
         <w:rPr>
-          <w:rFonts w:asciiTheme="minorHAnsi" w:eastAsia="宋体" w:hAnsiTheme="minorHAnsi" w:cstheme="minorHAnsi"/>
+          <w:rFonts w:asciiTheme="minorHAnsi" w:hAnsiTheme="minorHAnsi" w:cstheme="minorHAnsi"/>
           <w:i/>
           <w:iCs/>
           <w:sz w:val="16"/>
           <w:szCs w:val="16"/>
-          <w:lang w:eastAsia="zh-CN"/>
         </w:rPr>
       </w:pPr>
     </w:p>
@@ -4021,7 +3974,6 @@
           <w:rFonts w:ascii="Segoe UI" w:eastAsia="Times New Roman" w:hAnsi="Segoe UI" w:cs="Segoe UI"/>
           <w:sz w:val="18"/>
           <w:szCs w:val="18"/>
-          <w:lang w:eastAsia="zh-CN"/>
         </w:rPr>
       </w:pPr>
       <w:r>
@@ -4031,18 +3983,18 @@
           <w:bCs/>
           <w:sz w:val="36"/>
           <w:szCs w:val="36"/>
-          <w:lang w:val="en-GB" w:eastAsia="zh-CN"/>
+          <w:lang w:val="en-GB"/>
         </w:rPr>
         <w:t xml:space="preserve">Attachment </w:t>
       </w:r>
       <w:r>
         <w:rPr>
-          <w:rFonts w:ascii="Calibri" w:eastAsia="宋体" w:hAnsi="Calibri" w:cs="Calibri" w:hint="eastAsia"/>
+          <w:rFonts w:ascii="Calibri" w:hAnsi="Calibri" w:cs="Calibri" w:hint="eastAsia"/>
           <w:b/>
           <w:bCs/>
           <w:sz w:val="36"/>
           <w:szCs w:val="36"/>
-          <w:lang w:val="en-GB" w:eastAsia="zh-CN"/>
+          <w:lang w:val="en-GB"/>
         </w:rPr>
         <w:t>2</w:t>
       </w:r>
@@ -4053,7 +4005,7 @@
           <w:bCs/>
           <w:sz w:val="36"/>
           <w:szCs w:val="36"/>
-          <w:lang w:val="en-GB" w:eastAsia="zh-CN"/>
+          <w:lang w:val="en-GB"/>
         </w:rPr>
         <w:t>:</w:t>
       </w:r>
@@ -4064,7 +4016,7 @@
           <w:bCs/>
           <w:sz w:val="36"/>
           <w:szCs w:val="36"/>
-          <w:lang w:val="en-GB" w:eastAsia="zh-CN"/>
+          <w:lang w:val="en-GB"/>
         </w:rPr>
         <w:t xml:space="preserve"> </w:t>
       </w:r>
@@ -4075,7 +4027,7 @@
           <w:bCs/>
           <w:sz w:val="36"/>
           <w:szCs w:val="36"/>
-          <w:lang w:val="en-GB" w:eastAsia="zh-CN"/>
+          <w:lang w:val="en-GB"/>
         </w:rPr>
         <w:t xml:space="preserve">Upload Static </w:t>
       </w:r>
@@ -4087,7 +4039,7 @@
           <w:bCs/>
           <w:sz w:val="36"/>
           <w:szCs w:val="36"/>
-          <w:lang w:val="en-GB" w:eastAsia="zh-CN"/>
+          <w:lang w:val="en-GB"/>
         </w:rPr>
         <w:t>File</w:t>
       </w:r>
@@ -4098,7 +4050,7 @@
           <w:bCs/>
           <w:sz w:val="36"/>
           <w:szCs w:val="36"/>
-          <w:lang w:val="en-GB" w:eastAsia="zh-CN"/>
+          <w:lang w:val="en-GB"/>
         </w:rPr>
         <w:t>(</w:t>
       </w:r>
@@ -4110,16 +4062,16 @@
           <w:bCs/>
           <w:sz w:val="36"/>
           <w:szCs w:val="36"/>
-          <w:lang w:val="en-GB" w:eastAsia="zh-CN"/>
+          <w:lang w:val="en-GB"/>
         </w:rPr>
         <w:t>By Wintel)</w:t>
       </w:r>
       <w:r>
         <w:rPr>
-          <w:rFonts w:ascii="Calibri" w:eastAsia="宋体" w:hAnsi="Calibri" w:cs="Calibri"/>
+          <w:rFonts w:ascii="Calibri" w:hAnsi="Calibri" w:cs="Calibri"/>
           <w:sz w:val="36"/>
           <w:szCs w:val="36"/>
-          <w:lang w:val="en-GB" w:eastAsia="zh-CN"/>
+          <w:lang w:val="en-GB"/>
         </w:rPr>
         <w:t xml:space="preserve"> </w:t>
       </w:r>
@@ -4130,7 +4082,7 @@
           <w:bCs/>
           <w:sz w:val="36"/>
           <w:szCs w:val="36"/>
-          <w:lang w:val="en-GB" w:eastAsia="zh-CN"/>
+          <w:lang w:val="en-GB"/>
         </w:rPr>
         <w:t> </w:t>
       </w:r>
@@ -4142,13 +4094,11 @@
           <w:rFonts w:ascii="Segoe UI" w:eastAsia="Times New Roman" w:hAnsi="Segoe UI" w:cs="Segoe UI"/>
           <w:sz w:val="18"/>
           <w:szCs w:val="18"/>
-          <w:lang w:eastAsia="zh-CN"/>
         </w:rPr>
       </w:pPr>
       <w:r>
         <w:rPr>
           <w:rFonts w:eastAsia="Times New Roman"/>
-          <w:lang w:eastAsia="zh-CN"/>
         </w:rPr>
         <w:t>Contact point: </w:t>
       </w:r>
@@ -4160,16 +4110,16 @@
           <w:rFonts w:ascii="Calibri" w:eastAsia="Times New Roman" w:hAnsi="Calibri" w:cs="Calibri"/>
           <w:sz w:val="22"/>
           <w:szCs w:val="22"/>
-          <w:lang w:val="en-GB" w:eastAsia="zh-CN"/>
-        </w:rPr>
-      </w:pPr>
-      <w:bookmarkStart w:id="3" w:name="OLE_LINK26"/>
+          <w:lang w:val="en-GB"/>
+        </w:rPr>
+      </w:pPr>
+      <w:bookmarkStart w:id="4" w:name="OLE_LINK26"/>
       <w:r>
         <w:rPr>
           <w:rFonts w:ascii="Calibri" w:eastAsia="Times New Roman" w:hAnsi="Calibri" w:cs="Calibri"/>
           <w:sz w:val="22"/>
           <w:szCs w:val="22"/>
-          <w:lang w:val="en-GB" w:eastAsia="zh-CN"/>
+          <w:lang w:val="en-GB"/>
         </w:rPr>
         <w:t>{</w:t>
       </w:r>
@@ -4179,7 +4129,7 @@
           <w:rFonts w:ascii="Calibri" w:eastAsia="Times New Roman" w:hAnsi="Calibri" w:cs="Calibri"/>
           <w:sz w:val="22"/>
           <w:szCs w:val="22"/>
-          <w:lang w:val="en-GB" w:eastAsia="zh-CN"/>
+          <w:lang w:val="en-GB"/>
         </w:rPr>
         <w:t>contactsWintel</w:t>
       </w:r>
@@ -4189,19 +4139,15 @@
           <w:rFonts w:ascii="Calibri" w:eastAsia="Times New Roman" w:hAnsi="Calibri" w:cs="Calibri"/>
           <w:sz w:val="22"/>
           <w:szCs w:val="22"/>
-          <w:lang w:val="en-GB" w:eastAsia="zh-CN"/>
+          <w:lang w:val="en-GB"/>
         </w:rPr>
         <w:t>}</w:t>
       </w:r>
     </w:p>
-    <w:bookmarkEnd w:id="3"/>
+    <w:bookmarkEnd w:id="4"/>
     <w:p>
       <w:pPr>
         <w:textAlignment w:val="baseline"/>
-        <w:rPr>
-          <w:rFonts w:eastAsia="宋体"/>
-          <w:lang w:eastAsia="zh-CN"/>
-        </w:rPr>
       </w:pPr>
     </w:p>
     <w:p>
@@ -4209,13 +4155,11 @@
         <w:textAlignment w:val="baseline"/>
         <w:rPr>
           <w:rFonts w:eastAsia="Times New Roman"/>
-          <w:lang w:eastAsia="zh-CN"/>
         </w:rPr>
       </w:pPr>
       <w:r>
         <w:rPr>
           <w:rFonts w:eastAsia="Times New Roman"/>
-          <w:lang w:eastAsia="zh-CN"/>
         </w:rPr>
         <w:t>WHKEASEAAAPAP</w:t>
       </w:r>
@@ -4223,7 +4167,6 @@
       <w:r>
         <w:rPr>
           <w:rFonts w:eastAsia="Times New Roman"/>
-          <w:lang w:eastAsia="zh-CN"/>
         </w:rPr>
         <w:t>01 ,WHKEASEAAAPAP</w:t>
       </w:r>
@@ -4231,7 +4174,6 @@
       <w:r>
         <w:rPr>
           <w:rFonts w:eastAsia="Times New Roman"/>
-          <w:lang w:eastAsia="zh-CN"/>
         </w:rPr>
         <w:t>02   </w:t>
       </w:r>
@@ -4252,9 +4194,9 @@
         <w:tblLook w:val="04A0" w:firstRow="1" w:lastRow="0" w:firstColumn="1" w:lastColumn="0" w:noHBand="0" w:noVBand="1"/>
       </w:tblPr>
       <w:tblGrid>
-        <w:gridCol w:w="1983"/>
-        <w:gridCol w:w="3829"/>
-        <w:gridCol w:w="2870"/>
+        <w:gridCol w:w="2415"/>
+        <w:gridCol w:w="3372"/>
+        <w:gridCol w:w="2895"/>
       </w:tblGrid>
       <w:tr>
         <w:trPr>
@@ -4278,7 +4220,6 @@
               <w:textAlignment w:val="baseline"/>
               <w:rPr>
                 <w:rFonts w:eastAsia="Times New Roman"/>
-                <w:lang w:eastAsia="zh-CN"/>
               </w:rPr>
             </w:pPr>
             <w:r>
@@ -4287,7 +4228,6 @@
                 <w:color w:val="000000"/>
                 <w:sz w:val="22"/>
                 <w:szCs w:val="22"/>
-                <w:lang w:eastAsia="zh-CN"/>
               </w:rPr>
               <w:t>Type </w:t>
             </w:r>
@@ -4311,7 +4251,6 @@
               <w:textAlignment w:val="baseline"/>
               <w:rPr>
                 <w:rFonts w:eastAsia="Times New Roman"/>
-                <w:lang w:eastAsia="zh-CN"/>
               </w:rPr>
             </w:pPr>
             <w:r>
@@ -4320,7 +4259,6 @@
                 <w:color w:val="000000"/>
                 <w:sz w:val="22"/>
                 <w:szCs w:val="22"/>
-                <w:lang w:eastAsia="zh-CN"/>
               </w:rPr>
               <w:t>Source Folder Path </w:t>
             </w:r>
@@ -4344,7 +4282,6 @@
               <w:textAlignment w:val="baseline"/>
               <w:rPr>
                 <w:rFonts w:eastAsia="Times New Roman"/>
-                <w:lang w:eastAsia="zh-CN"/>
               </w:rPr>
             </w:pPr>
             <w:r>
@@ -4353,7 +4290,6 @@
                 <w:color w:val="000000"/>
                 <w:sz w:val="22"/>
                 <w:szCs w:val="22"/>
-                <w:lang w:eastAsia="zh-CN"/>
               </w:rPr>
               <w:t>Destination Path </w:t>
             </w:r>
@@ -4381,7 +4317,6 @@
               <w:textAlignment w:val="baseline"/>
               <w:rPr>
                 <w:rFonts w:eastAsia="Times New Roman"/>
-                <w:lang w:eastAsia="zh-CN"/>
               </w:rPr>
             </w:pPr>
             <w:r>
@@ -4416,7 +4351,6 @@
               <w:textAlignment w:val="baseline"/>
               <w:rPr>
                 <w:rFonts w:eastAsia="Times New Roman"/>
-                <w:lang w:eastAsia="zh-CN"/>
               </w:rPr>
             </w:pPr>
             <w:r>
@@ -4448,7 +4382,6 @@
               <w:textAlignment w:val="baseline"/>
               <w:rPr>
                 <w:rFonts w:eastAsia="Times New Roman"/>
-                <w:lang w:eastAsia="zh-CN"/>
               </w:rPr>
             </w:pPr>
             <w:r>
@@ -4480,12 +4413,11 @@
     <w:p>
       <w:pPr>
         <w:rPr>
-          <w:rFonts w:asciiTheme="minorHAnsi" w:eastAsia="宋体" w:hAnsiTheme="minorHAnsi" w:cstheme="minorHAnsi"/>
+          <w:rFonts w:asciiTheme="minorHAnsi" w:hAnsiTheme="minorHAnsi" w:cstheme="minorHAnsi"/>
           <w:i/>
           <w:iCs/>
           <w:sz w:val="16"/>
           <w:szCs w:val="16"/>
-          <w:lang w:eastAsia="zh-CN"/>
         </w:rPr>
       </w:pPr>
     </w:p>
@@ -4530,58 +4462,55 @@
     <w:p>
       <w:pPr>
         <w:rPr>
-          <w:rFonts w:asciiTheme="minorHAnsi" w:eastAsia="宋体" w:hAnsiTheme="minorHAnsi" w:cstheme="minorHAnsi"/>
+          <w:rFonts w:asciiTheme="minorHAnsi" w:hAnsiTheme="minorHAnsi" w:cstheme="minorHAnsi"/>
           <w:i/>
           <w:iCs/>
           <w:sz w:val="16"/>
           <w:szCs w:val="16"/>
-          <w:lang w:val="en-GB" w:eastAsia="zh-CN"/>
+          <w:lang w:val="en-GB"/>
         </w:rPr>
       </w:pPr>
     </w:p>
     <w:p>
       <w:pPr>
         <w:rPr>
-          <w:rFonts w:asciiTheme="minorHAnsi" w:eastAsia="宋体" w:hAnsiTheme="minorHAnsi" w:cstheme="minorHAnsi"/>
+          <w:rFonts w:asciiTheme="minorHAnsi" w:hAnsiTheme="minorHAnsi" w:cstheme="minorHAnsi"/>
           <w:i/>
           <w:iCs/>
           <w:sz w:val="16"/>
           <w:szCs w:val="16"/>
-          <w:lang w:eastAsia="zh-CN"/>
-        </w:rPr>
-      </w:pPr>
-      <w:r>
-        <w:rPr>
-          <w:rFonts w:asciiTheme="minorHAnsi" w:eastAsia="宋体" w:hAnsiTheme="minorHAnsi" w:cstheme="minorHAnsi"/>
+        </w:rPr>
+      </w:pPr>
+      <w:r>
+        <w:rPr>
+          <w:rFonts w:asciiTheme="minorHAnsi" w:hAnsiTheme="minorHAnsi" w:cstheme="minorHAnsi"/>
           <w:i/>
           <w:iCs/>
           <w:sz w:val="16"/>
           <w:szCs w:val="16"/>
-          <w:lang w:val="en-GB" w:eastAsia="zh-CN"/>
+          <w:lang w:val="en-GB"/>
         </w:rPr>
         <w:t>Execute below script files and save the result text. </w:t>
       </w:r>
       <w:r>
         <w:rPr>
-          <w:rFonts w:asciiTheme="minorHAnsi" w:eastAsia="宋体" w:hAnsiTheme="minorHAnsi" w:cstheme="minorHAnsi"/>
+          <w:rFonts w:asciiTheme="minorHAnsi" w:hAnsiTheme="minorHAnsi" w:cstheme="minorHAnsi"/>
           <w:b/>
           <w:bCs/>
           <w:i/>
           <w:iCs/>
           <w:sz w:val="16"/>
           <w:szCs w:val="16"/>
-          <w:lang w:eastAsia="zh-CN"/>
         </w:rPr>
         <w:t> </w:t>
       </w:r>
       <w:r>
         <w:rPr>
-          <w:rFonts w:asciiTheme="minorHAnsi" w:eastAsia="宋体" w:hAnsiTheme="minorHAnsi" w:cstheme="minorHAnsi"/>
+          <w:rFonts w:asciiTheme="minorHAnsi" w:hAnsiTheme="minorHAnsi" w:cstheme="minorHAnsi"/>
           <w:i/>
           <w:iCs/>
           <w:sz w:val="16"/>
           <w:szCs w:val="16"/>
-          <w:lang w:eastAsia="zh-CN"/>
         </w:rPr>
         <w:t> </w:t>
       </w:r>
@@ -4592,7 +4521,7 @@
           <w:rFonts w:asciiTheme="minorHAnsi" w:hAnsiTheme="minorHAnsi"/>
           <w:sz w:val="22"/>
           <w:szCs w:val="22"/>
-          <w:lang w:val="en-GB" w:eastAsia="zh-CN"/>
+          <w:lang w:val="en-GB"/>
         </w:rPr>
       </w:pPr>
       <w:r>
@@ -4600,7 +4529,7 @@
           <w:rFonts w:asciiTheme="minorHAnsi" w:hAnsiTheme="minorHAnsi"/>
           <w:sz w:val="22"/>
           <w:szCs w:val="22"/>
-          <w:lang w:val="en-GB" w:eastAsia="zh-CN"/>
+          <w:lang w:val="en-GB"/>
         </w:rPr>
         <w:t>Contact point:  </w:t>
       </w:r>
@@ -4611,7 +4540,7 @@
           <w:rFonts w:asciiTheme="minorHAnsi" w:hAnsiTheme="minorHAnsi"/>
           <w:sz w:val="22"/>
           <w:szCs w:val="22"/>
-          <w:lang w:val="en-GB" w:eastAsia="zh-CN"/>
+          <w:lang w:val="en-GB"/>
         </w:rPr>
       </w:pPr>
       <w:r>
@@ -4619,7 +4548,7 @@
           <w:rFonts w:asciiTheme="minorHAnsi" w:hAnsiTheme="minorHAnsi"/>
           <w:sz w:val="22"/>
           <w:szCs w:val="22"/>
-          <w:lang w:val="en-GB" w:eastAsia="zh-CN"/>
+          <w:lang w:val="en-GB"/>
         </w:rPr>
         <w:t>{</w:t>
       </w:r>
@@ -4629,7 +4558,7 @@
           <w:rFonts w:asciiTheme="minorHAnsi" w:hAnsiTheme="minorHAnsi"/>
           <w:sz w:val="22"/>
           <w:szCs w:val="22"/>
-          <w:lang w:val="en-GB" w:eastAsia="zh-CN"/>
+          <w:lang w:val="en-GB"/>
         </w:rPr>
         <w:t>contactsDba</w:t>
       </w:r>
@@ -4639,20 +4568,10 @@
           <w:rFonts w:asciiTheme="minorHAnsi" w:hAnsiTheme="minorHAnsi"/>
           <w:sz w:val="22"/>
           <w:szCs w:val="22"/>
-          <w:lang w:val="en-GB" w:eastAsia="zh-CN"/>
+          <w:lang w:val="en-GB"/>
         </w:rPr>
         <w:t>}</w:t>
       </w:r>
-    </w:p>
-    <w:p>
-      <w:pPr>
-        <w:rPr>
-          <w:rFonts w:asciiTheme="minorHAnsi" w:eastAsia="宋体" w:hAnsiTheme="minorHAnsi"/>
-          <w:sz w:val="22"/>
-          <w:szCs w:val="22"/>
-          <w:lang w:val="en-GB" w:eastAsia="zh-CN"/>
-        </w:rPr>
-      </w:pPr>
     </w:p>
     <w:p>
       <w:pPr>
@@ -4660,57 +4579,64 @@
           <w:rFonts w:asciiTheme="minorHAnsi" w:hAnsiTheme="minorHAnsi"/>
           <w:sz w:val="22"/>
           <w:szCs w:val="22"/>
-          <w:lang w:val="en-GB" w:eastAsia="zh-CN"/>
-        </w:rPr>
-      </w:pPr>
-      <w:r>
-        <w:rPr>
-          <w:rFonts w:asciiTheme="minorHAnsi" w:eastAsia="宋体" w:hAnsiTheme="minorHAnsi" w:hint="eastAsia"/>
+          <w:lang w:val="en-GB"/>
+        </w:rPr>
+      </w:pPr>
+    </w:p>
+    <w:p>
+      <w:pPr>
+        <w:rPr>
+          <w:rFonts w:asciiTheme="minorHAnsi" w:hAnsiTheme="minorHAnsi"/>
+          <w:sz w:val="22"/>
+          <w:szCs w:val="22"/>
+          <w:lang w:val="en-GB"/>
+        </w:rPr>
+      </w:pPr>
+      <w:r>
+        <w:rPr>
+          <w:rFonts w:asciiTheme="minorHAnsi" w:hAnsiTheme="minorHAnsi" w:hint="eastAsia"/>
           <w:b/>
           <w:bCs/>
           <w:sz w:val="22"/>
           <w:szCs w:val="22"/>
-          <w:lang w:val="en-GB" w:eastAsia="zh-CN"/>
+          <w:lang w:val="en-GB"/>
         </w:rPr>
         <w:t xml:space="preserve">Please run this step after Attachment </w:t>
       </w:r>
       <w:r>
         <w:rPr>
-          <w:rFonts w:asciiTheme="minorHAnsi" w:eastAsia="宋体" w:hAnsiTheme="minorHAnsi" w:hint="eastAsia"/>
+          <w:rFonts w:asciiTheme="minorHAnsi" w:hAnsiTheme="minorHAnsi" w:hint="eastAsia"/>
           <w:b/>
           <w:bCs/>
           <w:sz w:val="22"/>
           <w:szCs w:val="22"/>
-          <w:lang w:val="en-GB" w:eastAsia="zh-CN"/>
+          <w:lang w:val="en-GB"/>
         </w:rPr>
         <w:t>2</w:t>
       </w:r>
       <w:r>
         <w:rPr>
-          <w:rFonts w:asciiTheme="minorHAnsi" w:eastAsia="宋体" w:hAnsiTheme="minorHAnsi" w:hint="eastAsia"/>
+          <w:rFonts w:asciiTheme="minorHAnsi" w:hAnsiTheme="minorHAnsi" w:hint="eastAsia"/>
           <w:b/>
           <w:bCs/>
           <w:sz w:val="22"/>
           <w:szCs w:val="22"/>
-          <w:lang w:val="en-GB" w:eastAsia="zh-CN"/>
+          <w:lang w:val="en-GB"/>
         </w:rPr>
         <w:t xml:space="preserve"> </w:t>
       </w:r>
       <w:r>
         <w:rPr>
-          <w:rFonts w:eastAsia="宋体" w:hint="eastAsia"/>
+          <w:rFonts w:hint="eastAsia"/>
           <w:b/>
           <w:bCs/>
-          <w:lang w:eastAsia="zh-CN"/>
         </w:rPr>
         <w:t>is completed.</w:t>
       </w:r>
       <w:r>
         <w:rPr>
-          <w:rFonts w:eastAsia="宋体"/>
           <w:b/>
           <w:bCs/>
-          <w:lang w:eastAsia="zh-CN"/>
         </w:rPr>
         <w:br/>
       </w:r>
@@ -4731,13 +4657,13 @@
         <w:tblLook w:val="04A0" w:firstRow="1" w:lastRow="0" w:firstColumn="1" w:lastColumn="0" w:noHBand="0" w:noVBand="1"/>
       </w:tblPr>
       <w:tblGrid>
-        <w:gridCol w:w="2091"/>
-        <w:gridCol w:w="677"/>
-        <w:gridCol w:w="828"/>
-        <w:gridCol w:w="1098"/>
-        <w:gridCol w:w="482"/>
-        <w:gridCol w:w="1379"/>
-        <w:gridCol w:w="2127"/>
+        <w:gridCol w:w="2069"/>
+        <w:gridCol w:w="720"/>
+        <w:gridCol w:w="896"/>
+        <w:gridCol w:w="1073"/>
+        <w:gridCol w:w="456"/>
+        <w:gridCol w:w="1249"/>
+        <w:gridCol w:w="2219"/>
       </w:tblGrid>
       <w:tr>
         <w:trPr>
@@ -4758,22 +4684,20 @@
           <w:p>
             <w:pPr>
               <w:rPr>
-                <w:rFonts w:asciiTheme="minorHAnsi" w:eastAsia="宋体" w:hAnsiTheme="minorHAnsi" w:cstheme="minorHAnsi"/>
+                <w:rFonts w:asciiTheme="minorHAnsi" w:hAnsiTheme="minorHAnsi" w:cstheme="minorHAnsi"/>
                 <w:i/>
                 <w:iCs/>
                 <w:sz w:val="16"/>
                 <w:szCs w:val="16"/>
-                <w:lang w:eastAsia="zh-CN"/>
               </w:rPr>
             </w:pPr>
             <w:r>
               <w:rPr>
-                <w:rFonts w:asciiTheme="minorHAnsi" w:eastAsia="宋体" w:hAnsiTheme="minorHAnsi" w:cstheme="minorHAnsi"/>
+                <w:rFonts w:asciiTheme="minorHAnsi" w:hAnsiTheme="minorHAnsi" w:cstheme="minorHAnsi"/>
                 <w:i/>
                 <w:iCs/>
                 <w:sz w:val="16"/>
                 <w:szCs w:val="16"/>
-                <w:lang w:eastAsia="zh-CN"/>
               </w:rPr>
               <w:t>#  </w:t>
             </w:r>
@@ -4794,22 +4718,20 @@
           <w:p>
             <w:pPr>
               <w:rPr>
-                <w:rFonts w:asciiTheme="minorHAnsi" w:eastAsia="宋体" w:hAnsiTheme="minorHAnsi" w:cstheme="minorHAnsi"/>
+                <w:rFonts w:asciiTheme="minorHAnsi" w:hAnsiTheme="minorHAnsi" w:cstheme="minorHAnsi"/>
                 <w:i/>
                 <w:iCs/>
                 <w:sz w:val="16"/>
                 <w:szCs w:val="16"/>
-                <w:lang w:eastAsia="zh-CN"/>
               </w:rPr>
             </w:pPr>
             <w:r>
               <w:rPr>
-                <w:rFonts w:asciiTheme="minorHAnsi" w:eastAsia="宋体" w:hAnsiTheme="minorHAnsi" w:cstheme="minorHAnsi"/>
+                <w:rFonts w:asciiTheme="minorHAnsi" w:hAnsiTheme="minorHAnsi" w:cstheme="minorHAnsi"/>
                 <w:i/>
                 <w:iCs/>
                 <w:sz w:val="16"/>
                 <w:szCs w:val="16"/>
-                <w:lang w:eastAsia="zh-CN"/>
               </w:rPr>
               <w:t>Server  </w:t>
             </w:r>
@@ -4830,22 +4752,20 @@
           <w:p>
             <w:pPr>
               <w:rPr>
-                <w:rFonts w:asciiTheme="minorHAnsi" w:eastAsia="宋体" w:hAnsiTheme="minorHAnsi" w:cstheme="minorHAnsi"/>
+                <w:rFonts w:asciiTheme="minorHAnsi" w:hAnsiTheme="minorHAnsi" w:cstheme="minorHAnsi"/>
                 <w:i/>
                 <w:iCs/>
                 <w:sz w:val="16"/>
                 <w:szCs w:val="16"/>
-                <w:lang w:eastAsia="zh-CN"/>
               </w:rPr>
             </w:pPr>
             <w:r>
               <w:rPr>
-                <w:rFonts w:asciiTheme="minorHAnsi" w:eastAsia="宋体" w:hAnsiTheme="minorHAnsi" w:cstheme="minorHAnsi"/>
+                <w:rFonts w:asciiTheme="minorHAnsi" w:hAnsiTheme="minorHAnsi" w:cstheme="minorHAnsi"/>
                 <w:i/>
                 <w:iCs/>
                 <w:sz w:val="16"/>
                 <w:szCs w:val="16"/>
-                <w:lang w:eastAsia="zh-CN"/>
               </w:rPr>
               <w:t>Script location  </w:t>
             </w:r>
@@ -4866,22 +4786,20 @@
           <w:p>
             <w:pPr>
               <w:rPr>
-                <w:rFonts w:asciiTheme="minorHAnsi" w:eastAsia="宋体" w:hAnsiTheme="minorHAnsi" w:cstheme="minorHAnsi"/>
+                <w:rFonts w:asciiTheme="minorHAnsi" w:hAnsiTheme="minorHAnsi" w:cstheme="minorHAnsi"/>
                 <w:i/>
                 <w:iCs/>
                 <w:sz w:val="16"/>
                 <w:szCs w:val="16"/>
-                <w:lang w:eastAsia="zh-CN"/>
               </w:rPr>
             </w:pPr>
             <w:r>
               <w:rPr>
-                <w:rFonts w:asciiTheme="minorHAnsi" w:eastAsia="宋体" w:hAnsiTheme="minorHAnsi" w:cstheme="minorHAnsi"/>
+                <w:rFonts w:asciiTheme="minorHAnsi" w:hAnsiTheme="minorHAnsi" w:cstheme="minorHAnsi"/>
                 <w:i/>
                 <w:iCs/>
                 <w:sz w:val="16"/>
                 <w:szCs w:val="16"/>
-                <w:lang w:eastAsia="zh-CN"/>
               </w:rPr>
               <w:t>Script name  </w:t>
             </w:r>
@@ -4902,22 +4820,20 @@
           <w:p>
             <w:pPr>
               <w:rPr>
-                <w:rFonts w:asciiTheme="minorHAnsi" w:eastAsia="宋体" w:hAnsiTheme="minorHAnsi" w:cstheme="minorHAnsi"/>
+                <w:rFonts w:asciiTheme="minorHAnsi" w:hAnsiTheme="minorHAnsi" w:cstheme="minorHAnsi"/>
                 <w:i/>
                 <w:iCs/>
                 <w:sz w:val="16"/>
                 <w:szCs w:val="16"/>
-                <w:lang w:eastAsia="zh-CN"/>
               </w:rPr>
             </w:pPr>
             <w:r>
               <w:rPr>
-                <w:rFonts w:asciiTheme="minorHAnsi" w:eastAsia="宋体" w:hAnsiTheme="minorHAnsi" w:cstheme="minorHAnsi"/>
+                <w:rFonts w:asciiTheme="minorHAnsi" w:hAnsiTheme="minorHAnsi" w:cstheme="minorHAnsi"/>
                 <w:i/>
                 <w:iCs/>
                 <w:sz w:val="16"/>
                 <w:szCs w:val="16"/>
-                <w:lang w:eastAsia="zh-CN"/>
               </w:rPr>
               <w:t>Target Env  </w:t>
             </w:r>
@@ -4938,22 +4854,20 @@
           <w:p>
             <w:pPr>
               <w:rPr>
-                <w:rFonts w:asciiTheme="minorHAnsi" w:eastAsia="宋体" w:hAnsiTheme="minorHAnsi" w:cstheme="minorHAnsi"/>
+                <w:rFonts w:asciiTheme="minorHAnsi" w:hAnsiTheme="minorHAnsi" w:cstheme="minorHAnsi"/>
                 <w:i/>
                 <w:iCs/>
                 <w:sz w:val="16"/>
                 <w:szCs w:val="16"/>
-                <w:lang w:eastAsia="zh-CN"/>
               </w:rPr>
             </w:pPr>
             <w:r>
               <w:rPr>
-                <w:rFonts w:asciiTheme="minorHAnsi" w:eastAsia="宋体" w:hAnsiTheme="minorHAnsi" w:cstheme="minorHAnsi"/>
+                <w:rFonts w:asciiTheme="minorHAnsi" w:hAnsiTheme="minorHAnsi" w:cstheme="minorHAnsi"/>
                 <w:i/>
                 <w:iCs/>
                 <w:sz w:val="16"/>
                 <w:szCs w:val="16"/>
-                <w:lang w:eastAsia="zh-CN"/>
               </w:rPr>
               <w:t>Schema Change?  </w:t>
             </w:r>
@@ -4974,22 +4888,20 @@
           <w:p>
             <w:pPr>
               <w:rPr>
-                <w:rFonts w:asciiTheme="minorHAnsi" w:eastAsia="宋体" w:hAnsiTheme="minorHAnsi" w:cstheme="minorHAnsi"/>
+                <w:rFonts w:asciiTheme="minorHAnsi" w:hAnsiTheme="minorHAnsi" w:cstheme="minorHAnsi"/>
                 <w:i/>
                 <w:iCs/>
                 <w:sz w:val="16"/>
                 <w:szCs w:val="16"/>
-                <w:lang w:eastAsia="zh-CN"/>
               </w:rPr>
             </w:pPr>
             <w:r>
               <w:rPr>
-                <w:rFonts w:asciiTheme="minorHAnsi" w:eastAsia="宋体" w:hAnsiTheme="minorHAnsi" w:cstheme="minorHAnsi"/>
+                <w:rFonts w:asciiTheme="minorHAnsi" w:hAnsiTheme="minorHAnsi" w:cstheme="minorHAnsi"/>
                 <w:i/>
                 <w:iCs/>
                 <w:sz w:val="16"/>
                 <w:szCs w:val="16"/>
-                <w:lang w:eastAsia="zh-CN"/>
               </w:rPr>
               <w:t>Project Code  </w:t>
             </w:r>
@@ -5015,10 +4927,9 @@
             <w:pPr>
               <w:ind w:left="720"/>
               <w:rPr>
-                <w:rFonts w:asciiTheme="minorHAnsi" w:eastAsia="宋体" w:hAnsiTheme="minorHAnsi" w:cstheme="minorHAnsi" w:hint="eastAsia"/>
+                <w:rFonts w:asciiTheme="minorHAnsi" w:hAnsiTheme="minorHAnsi" w:cstheme="minorHAnsi"/>
                 <w:sz w:val="16"/>
                 <w:szCs w:val="16"/>
-                <w:lang w:eastAsia="zh-CN"/>
               </w:rPr>
             </w:pPr>
             <w:r>
@@ -5026,21 +4937,14 @@
             </w:r>
             <w:r>
               <w:rPr>
-                <w:rFonts w:asciiTheme="minorHAnsi" w:eastAsia="宋体" w:hAnsiTheme="minorHAnsi" w:cstheme="minorHAnsi"/>
+                <w:rFonts w:asciiTheme="minorHAnsi" w:hAnsiTheme="minorHAnsi" w:cstheme="minorHAnsi"/>
                 <w:sz w:val="16"/>
                 <w:szCs w:val="16"/>
-                <w:lang w:eastAsia="zh-CN"/>
               </w:rPr>
               <w:t> </w:t>
             </w:r>
             <w:r>
-              <w:t>{se</w:t>
-            </w:r>
-            <w:r>
-              <w:t>q</w:t>
-            </w:r>
-            <w:r>
-              <w:t>}</w:t>
+              <w:t>{seq}</w:t>
             </w:r>
           </w:p>
         </w:tc>
@@ -5058,17 +4962,16 @@
           <w:p>
             <w:pPr>
               <w:rPr>
-                <w:rFonts w:asciiTheme="minorHAnsi" w:eastAsia="宋体" w:hAnsiTheme="minorHAnsi" w:cstheme="minorHAnsi"/>
+                <w:rFonts w:asciiTheme="minorHAnsi" w:hAnsiTheme="minorHAnsi" w:cstheme="minorHAnsi"/>
                 <w:sz w:val="16"/>
                 <w:szCs w:val="16"/>
-                <w:lang w:eastAsia="zh-CN"/>
               </w:rPr>
             </w:pPr>
-            <w:bookmarkStart w:id="4" w:name="OLE_LINK6"/>
+            <w:bookmarkStart w:id="5" w:name="OLE_LINK6"/>
             <w:r>
               <w:t>{server}</w:t>
             </w:r>
-            <w:bookmarkEnd w:id="4"/>
+            <w:bookmarkEnd w:id="5"/>
           </w:p>
         </w:tc>
         <w:tc>
@@ -5085,10 +4988,9 @@
           <w:p>
             <w:pPr>
               <w:rPr>
-                <w:rFonts w:asciiTheme="minorHAnsi" w:eastAsia="宋体" w:hAnsiTheme="minorHAnsi" w:cstheme="minorHAnsi"/>
+                <w:rFonts w:asciiTheme="minorHAnsi" w:hAnsiTheme="minorHAnsi" w:cstheme="minorHAnsi"/>
                 <w:sz w:val="16"/>
                 <w:szCs w:val="16"/>
-                <w:lang w:eastAsia="zh-CN"/>
               </w:rPr>
             </w:pPr>
             <w:r>
@@ -5110,10 +5012,9 @@
           <w:p>
             <w:pPr>
               <w:rPr>
-                <w:rFonts w:asciiTheme="minorHAnsi" w:eastAsia="宋体" w:hAnsiTheme="minorHAnsi" w:cstheme="minorHAnsi"/>
+                <w:rFonts w:asciiTheme="minorHAnsi" w:hAnsiTheme="minorHAnsi" w:cstheme="minorHAnsi"/>
                 <w:sz w:val="16"/>
                 <w:szCs w:val="16"/>
-                <w:lang w:eastAsia="zh-CN"/>
               </w:rPr>
             </w:pPr>
             <w:r>
@@ -5143,10 +5044,9 @@
           <w:p>
             <w:pPr>
               <w:rPr>
-                <w:rFonts w:asciiTheme="minorHAnsi" w:eastAsia="宋体" w:hAnsiTheme="minorHAnsi" w:cstheme="minorHAnsi"/>
+                <w:rFonts w:asciiTheme="minorHAnsi" w:hAnsiTheme="minorHAnsi" w:cstheme="minorHAnsi"/>
                 <w:sz w:val="16"/>
                 <w:szCs w:val="16"/>
-                <w:lang w:eastAsia="zh-CN"/>
               </w:rPr>
             </w:pPr>
             <w:r>
@@ -5168,10 +5068,9 @@
           <w:p>
             <w:pPr>
               <w:rPr>
-                <w:rFonts w:asciiTheme="minorHAnsi" w:eastAsia="宋体" w:hAnsiTheme="minorHAnsi" w:cstheme="minorHAnsi"/>
+                <w:rFonts w:asciiTheme="minorHAnsi" w:hAnsiTheme="minorHAnsi" w:cstheme="minorHAnsi"/>
                 <w:sz w:val="16"/>
                 <w:szCs w:val="16"/>
-                <w:lang w:eastAsia="zh-CN"/>
               </w:rPr>
             </w:pPr>
             <w:r>
@@ -5201,10 +5100,9 @@
           <w:p>
             <w:pPr>
               <w:rPr>
-                <w:rFonts w:asciiTheme="minorHAnsi" w:eastAsia="宋体" w:hAnsiTheme="minorHAnsi" w:cstheme="minorHAnsi"/>
+                <w:rFonts w:asciiTheme="minorHAnsi" w:hAnsiTheme="minorHAnsi" w:cstheme="minorHAnsi"/>
                 <w:sz w:val="16"/>
                 <w:szCs w:val="16"/>
-                <w:lang w:eastAsia="zh-CN"/>
               </w:rPr>
             </w:pPr>
             <w:r>
@@ -5229,7 +5127,6 @@
             <w:r>
               <w:rPr>
                 <w:rFonts w:hint="eastAsia"/>
-                <w:lang w:eastAsia="zh-CN"/>
               </w:rPr>
               <w:t>}</w:t>
             </w:r>
@@ -5382,43 +5279,36 @@
     <w:p>
       <w:pPr>
         <w:rPr>
-          <w:rFonts w:eastAsia="宋体"/>
           <w:b/>
           <w:bCs/>
           <w:color w:val="000000" w:themeColor="text1"/>
           <w:sz w:val="22"/>
           <w:szCs w:val="22"/>
-          <w:lang w:eastAsia="zh-CN"/>
-        </w:rPr>
-      </w:pPr>
-      <w:r>
-        <w:rPr>
-          <w:rFonts w:eastAsia="宋体"/>
+        </w:rPr>
+      </w:pPr>
+      <w:r>
+        <w:rPr>
           <w:b/>
           <w:bCs/>
           <w:color w:val="000000" w:themeColor="text1"/>
           <w:sz w:val="22"/>
           <w:szCs w:val="22"/>
           <w:u w:val="single"/>
-          <w:lang w:eastAsia="zh-CN"/>
         </w:rPr>
         <w:t>Rollback Plan &amp; Checks</w:t>
       </w:r>
       <w:r>
         <w:rPr>
-          <w:rFonts w:eastAsia="宋体"/>
           <w:b/>
           <w:bCs/>
           <w:color w:val="000000" w:themeColor="text1"/>
           <w:sz w:val="22"/>
           <w:szCs w:val="22"/>
-          <w:lang w:eastAsia="zh-CN"/>
         </w:rPr>
         <w:t>&lt;</w:t>
       </w:r>
       <w:r>
         <w:rPr>
-          <w:rFonts w:eastAsia="宋体"/>
           <w:b/>
           <w:bCs/>
           <w:i/>
@@ -5426,25 +5316,21 @@
           <w:color w:val="000000" w:themeColor="text1"/>
           <w:sz w:val="22"/>
           <w:szCs w:val="22"/>
-          <w:lang w:eastAsia="zh-CN"/>
         </w:rPr>
         <w:t>Put the rollback steps/setup/attachment</w:t>
       </w:r>
       <w:r>
         <w:rPr>
-          <w:rFonts w:eastAsia="宋体"/>
           <w:b/>
           <w:bCs/>
           <w:color w:val="000000" w:themeColor="text1"/>
           <w:sz w:val="22"/>
           <w:szCs w:val="22"/>
-          <w:lang w:eastAsia="zh-CN"/>
         </w:rPr>
         <w:t>/</w:t>
       </w:r>
       <w:r>
         <w:rPr>
-          <w:rFonts w:eastAsia="宋体"/>
           <w:b/>
           <w:bCs/>
           <w:i/>
@@ -5452,14 +5338,12 @@
           <w:color w:val="000000" w:themeColor="text1"/>
           <w:sz w:val="22"/>
           <w:szCs w:val="22"/>
-          <w:lang w:eastAsia="zh-CN"/>
         </w:rPr>
         <w:t>Post Rollback </w:t>
       </w:r>
       <w:proofErr w:type="spellStart"/>
       <w:r>
         <w:rPr>
-          <w:rFonts w:eastAsia="宋体"/>
           <w:b/>
           <w:bCs/>
           <w:i/>
@@ -5467,20 +5351,17 @@
           <w:color w:val="000000" w:themeColor="text1"/>
           <w:sz w:val="22"/>
           <w:szCs w:val="22"/>
-          <w:lang w:eastAsia="zh-CN"/>
         </w:rPr>
         <w:t>Chceklist</w:t>
       </w:r>
       <w:proofErr w:type="spellEnd"/>
       <w:r>
         <w:rPr>
-          <w:rFonts w:eastAsia="宋体"/>
           <w:b/>
           <w:bCs/>
           <w:color w:val="000000" w:themeColor="text1"/>
           <w:sz w:val="22"/>
           <w:szCs w:val="22"/>
-          <w:lang w:eastAsia="zh-CN"/>
         </w:rPr>
         <w:t>&gt;  </w:t>
       </w:r>
@@ -5488,24 +5369,20 @@
     <w:p>
       <w:pPr>
         <w:rPr>
-          <w:rFonts w:eastAsia="宋体"/>
           <w:b/>
           <w:bCs/>
           <w:color w:val="000000" w:themeColor="text1"/>
           <w:sz w:val="22"/>
           <w:szCs w:val="22"/>
-          <w:lang w:eastAsia="zh-CN"/>
-        </w:rPr>
-      </w:pPr>
-      <w:r>
-        <w:rPr>
-          <w:rFonts w:eastAsia="宋体"/>
+        </w:rPr>
+      </w:pPr>
+      <w:r>
+        <w:rPr>
           <w:b/>
           <w:bCs/>
           <w:color w:val="000000" w:themeColor="text1"/>
           <w:sz w:val="22"/>
           <w:szCs w:val="22"/>
-          <w:lang w:eastAsia="zh-CN"/>
         </w:rPr>
         <w:t>Only if migration failed and instructed by AA IT, perform below roll back steps. </w:t>
       </w:r>
@@ -5513,24 +5390,20 @@
     <w:p>
       <w:pPr>
         <w:rPr>
-          <w:rFonts w:eastAsia="宋体"/>
           <w:b/>
           <w:bCs/>
           <w:color w:val="000000" w:themeColor="text1"/>
           <w:sz w:val="22"/>
           <w:szCs w:val="22"/>
-          <w:lang w:eastAsia="zh-CN"/>
-        </w:rPr>
-      </w:pPr>
-      <w:r>
-        <w:rPr>
-          <w:rFonts w:eastAsia="宋体"/>
+        </w:rPr>
+      </w:pPr>
+      <w:r>
+        <w:rPr>
           <w:b/>
           <w:bCs/>
           <w:color w:val="000000" w:themeColor="text1"/>
           <w:sz w:val="22"/>
           <w:szCs w:val="22"/>
-          <w:lang w:eastAsia="zh-CN"/>
         </w:rPr>
         <w:t> </w:t>
       </w:r>
@@ -5538,65 +5411,55 @@
     <w:p>
       <w:pPr>
         <w:rPr>
-          <w:rFonts w:eastAsia="宋体"/>
           <w:b/>
           <w:bCs/>
           <w:color w:val="000000" w:themeColor="text1"/>
           <w:sz w:val="22"/>
           <w:szCs w:val="22"/>
-          <w:lang w:eastAsia="zh-CN"/>
-        </w:rPr>
-      </w:pPr>
-      <w:r>
-        <w:rPr>
-          <w:rFonts w:eastAsia="宋体"/>
+        </w:rPr>
+      </w:pPr>
+      <w:r>
+        <w:rPr>
           <w:b/>
           <w:bCs/>
           <w:color w:val="000000" w:themeColor="text1"/>
           <w:sz w:val="22"/>
           <w:szCs w:val="22"/>
           <w:u w:val="single"/>
-          <w:lang w:eastAsia="zh-CN"/>
         </w:rPr>
         <w:t>For attachment </w:t>
       </w:r>
       <w:proofErr w:type="gramStart"/>
       <w:r>
         <w:rPr>
-          <w:rFonts w:eastAsia="宋体"/>
           <w:b/>
           <w:bCs/>
           <w:color w:val="000000" w:themeColor="text1"/>
           <w:sz w:val="22"/>
           <w:szCs w:val="22"/>
           <w:u w:val="single"/>
-          <w:lang w:eastAsia="zh-CN"/>
         </w:rPr>
         <w:t>1 :</w:t>
       </w:r>
       <w:proofErr w:type="gramEnd"/>
       <w:r>
         <w:rPr>
-          <w:rFonts w:eastAsia="宋体"/>
           <w:b/>
           <w:bCs/>
           <w:color w:val="000000" w:themeColor="text1"/>
           <w:sz w:val="22"/>
           <w:szCs w:val="22"/>
           <w:u w:val="single"/>
-          <w:lang w:eastAsia="zh-CN"/>
         </w:rPr>
         <w:t> Front End Web and API</w:t>
       </w:r>
       <w:r>
         <w:rPr>
-          <w:rFonts w:eastAsia="宋体"/>
           <w:b/>
           <w:bCs/>
           <w:color w:val="000000" w:themeColor="text1"/>
           <w:sz w:val="22"/>
           <w:szCs w:val="22"/>
-          <w:lang w:eastAsia="zh-CN"/>
         </w:rPr>
         <w:t> </w:t>
       </w:r>
@@ -5604,72 +5467,61 @@
     <w:p>
       <w:pPr>
         <w:rPr>
-          <w:rFonts w:eastAsia="宋体"/>
           <w:b/>
           <w:bCs/>
           <w:color w:val="000000" w:themeColor="text1"/>
           <w:sz w:val="22"/>
           <w:szCs w:val="22"/>
-          <w:lang w:eastAsia="zh-CN"/>
-        </w:rPr>
-      </w:pPr>
-      <w:r>
-        <w:rPr>
-          <w:rFonts w:eastAsia="宋体"/>
+        </w:rPr>
+      </w:pPr>
+      <w:r>
+        <w:rPr>
           <w:b/>
           <w:bCs/>
           <w:color w:val="000000" w:themeColor="text1"/>
           <w:sz w:val="22"/>
           <w:szCs w:val="22"/>
-          <w:lang w:eastAsia="zh-CN"/>
         </w:rPr>
         <w:t>1.</w:t>
       </w:r>
       <w:r>
         <w:rPr>
-          <w:rFonts w:eastAsia="宋体"/>
           <w:b/>
           <w:bCs/>
           <w:color w:val="000000" w:themeColor="text1"/>
           <w:sz w:val="22"/>
           <w:szCs w:val="22"/>
-          <w:lang w:eastAsia="zh-CN"/>
         </w:rPr>
         <w:tab/>
       </w:r>
       <w:r>
         <w:rPr>
-          <w:rFonts w:eastAsia="宋体"/>
           <w:b/>
           <w:bCs/>
           <w:color w:val="000000" w:themeColor="text1"/>
           <w:sz w:val="22"/>
           <w:szCs w:val="22"/>
-          <w:lang w:eastAsia="zh-CN"/>
         </w:rPr>
         <w:t>Migration Team to perform rollback using the previous Jira backup versio</w:t>
       </w:r>
       <w:r>
         <w:rPr>
-          <w:rFonts w:eastAsia="宋体" w:hint="eastAsia"/>
+          <w:rFonts w:hint="eastAsia"/>
           <w:b/>
           <w:bCs/>
           <w:color w:val="000000" w:themeColor="text1"/>
           <w:sz w:val="22"/>
           <w:szCs w:val="22"/>
-          <w:lang w:eastAsia="zh-CN"/>
         </w:rPr>
         <w:t>n</w:t>
       </w:r>
       <w:r>
         <w:rPr>
-          <w:rFonts w:eastAsia="宋体"/>
           <w:b/>
           <w:bCs/>
           <w:color w:val="000000" w:themeColor="text1"/>
           <w:sz w:val="22"/>
           <w:szCs w:val="22"/>
-          <w:lang w:eastAsia="zh-CN"/>
         </w:rPr>
         <w:t>.  </w:t>
       </w:r>
@@ -5677,24 +5529,20 @@
     <w:p>
       <w:pPr>
         <w:rPr>
-          <w:rFonts w:eastAsia="宋体"/>
           <w:b/>
           <w:bCs/>
           <w:color w:val="000000" w:themeColor="text1"/>
           <w:sz w:val="22"/>
           <w:szCs w:val="22"/>
-          <w:lang w:eastAsia="zh-CN"/>
-        </w:rPr>
-      </w:pPr>
-      <w:r>
-        <w:rPr>
-          <w:rFonts w:eastAsia="宋体"/>
+        </w:rPr>
+      </w:pPr>
+      <w:r>
+        <w:rPr>
           <w:b/>
           <w:bCs/>
           <w:color w:val="000000" w:themeColor="text1"/>
           <w:sz w:val="22"/>
           <w:szCs w:val="22"/>
-          <w:lang w:eastAsia="zh-CN"/>
         </w:rPr>
         <w:t> </w:t>
       </w:r>
@@ -5702,423 +5550,350 @@
     <w:p>
       <w:pPr>
         <w:rPr>
-          <w:rFonts w:eastAsia="宋体"/>
           <w:color w:val="000000" w:themeColor="text1"/>
           <w:sz w:val="22"/>
           <w:szCs w:val="22"/>
-          <w:lang w:eastAsia="zh-CN"/>
-        </w:rPr>
-      </w:pPr>
-      <w:proofErr w:type="gramStart"/>
-      <w:r>
-        <w:rPr>
-          <w:rFonts w:eastAsia="宋体"/>
-          <w:color w:val="000000" w:themeColor="text1"/>
-          <w:sz w:val="22"/>
-          <w:szCs w:val="22"/>
-          <w:lang w:eastAsia="zh-CN"/>
-        </w:rPr>
-        <w:t>aa-web</w:t>
-      </w:r>
-      <w:proofErr w:type="gramEnd"/>
-      <w:r>
-        <w:rPr>
-          <w:rFonts w:eastAsia="宋体"/>
-          <w:color w:val="000000" w:themeColor="text1"/>
-          <w:sz w:val="22"/>
-          <w:szCs w:val="22"/>
-          <w:lang w:eastAsia="zh-CN"/>
-        </w:rPr>
-        <w:t>   </w:t>
-      </w:r>
-    </w:p>
-    <w:p>
-      <w:pPr>
-        <w:numPr>
-          <w:ilvl w:val="0"/>
-          <w:numId w:val="4"/>
-        </w:numPr>
-        <w:rPr>
-          <w:rFonts w:eastAsia="宋体"/>
-          <w:color w:val="000000" w:themeColor="text1"/>
-          <w:sz w:val="22"/>
-          <w:szCs w:val="22"/>
-          <w:lang w:eastAsia="zh-CN"/>
-        </w:rPr>
-      </w:pPr>
-      <w:r>
-        <w:rPr>
-          <w:rFonts w:eastAsia="宋体"/>
-          <w:color w:val="000000" w:themeColor="text1"/>
-          <w:sz w:val="22"/>
-          <w:szCs w:val="22"/>
-          <w:lang w:eastAsia="zh-CN"/>
-        </w:rPr>
-        <w:t>{</w:t>
-      </w:r>
-      <w:proofErr w:type="spellStart"/>
-      <w:r>
-        <w:rPr>
-          <w:rFonts w:eastAsia="宋体"/>
-          <w:color w:val="000000" w:themeColor="text1"/>
-          <w:sz w:val="22"/>
-          <w:szCs w:val="22"/>
-          <w:lang w:eastAsia="zh-CN"/>
-        </w:rPr>
-        <w:t>jiraAaWeb</w:t>
-      </w:r>
-      <w:r>
-        <w:rPr>
-          <w:rFonts w:eastAsia="宋体"/>
-          <w:color w:val="000000" w:themeColor="text1"/>
-          <w:sz w:val="22"/>
-          <w:szCs w:val="22"/>
-          <w:lang w:eastAsia="zh-CN"/>
-        </w:rPr>
-        <w:t>RollBack</w:t>
-      </w:r>
-      <w:proofErr w:type="spellEnd"/>
-      <w:r>
-        <w:rPr>
-          <w:rFonts w:eastAsia="宋体"/>
-          <w:color w:val="000000" w:themeColor="text1"/>
-          <w:sz w:val="22"/>
-          <w:szCs w:val="22"/>
-          <w:lang w:eastAsia="zh-CN"/>
-        </w:rPr>
-        <w:t>}</w:t>
-      </w:r>
-      <w:r>
-        <w:rPr>
-          <w:rFonts w:eastAsia="宋体"/>
-          <w:color w:val="000000" w:themeColor="text1"/>
-          <w:sz w:val="22"/>
-          <w:szCs w:val="22"/>
-          <w:lang w:eastAsia="zh-CN"/>
-        </w:rPr>
-        <w:t xml:space="preserve"> </w:t>
-      </w:r>
-    </w:p>
-    <w:p>
-      <w:pPr>
-        <w:numPr>
-          <w:ilvl w:val="0"/>
-          <w:numId w:val="4"/>
-        </w:numPr>
-        <w:rPr>
-          <w:rFonts w:eastAsia="宋体"/>
-          <w:color w:val="000000" w:themeColor="text1"/>
-          <w:sz w:val="22"/>
-          <w:szCs w:val="22"/>
-          <w:lang w:eastAsia="zh-CN"/>
-        </w:rPr>
-      </w:pPr>
-      <w:r>
-        <w:rPr>
-          <w:rFonts w:eastAsia="宋体"/>
-          <w:color w:val="000000" w:themeColor="text1"/>
-          <w:sz w:val="22"/>
-          <w:szCs w:val="22"/>
-          <w:lang w:eastAsia="zh-CN"/>
-        </w:rPr>
-        <w:t>Click on “Start Deploy”   </w:t>
-      </w:r>
-    </w:p>
-    <w:p>
-      <w:pPr>
-        <w:numPr>
-          <w:ilvl w:val="0"/>
-          <w:numId w:val="5"/>
-        </w:numPr>
-        <w:rPr>
-          <w:rFonts w:eastAsia="宋体"/>
-          <w:color w:val="000000" w:themeColor="text1"/>
-          <w:sz w:val="22"/>
-          <w:szCs w:val="22"/>
-          <w:lang w:eastAsia="zh-CN"/>
-        </w:rPr>
-      </w:pPr>
-      <w:r>
-        <w:rPr>
-          <w:rFonts w:eastAsia="宋体"/>
-          <w:color w:val="000000" w:themeColor="text1"/>
-          <w:sz w:val="22"/>
-          <w:szCs w:val="22"/>
-          <w:lang w:eastAsia="zh-CN"/>
-        </w:rPr>
-        <w:t>The status will change to “DEPLOYING” after a while.   </w:t>
-      </w:r>
-    </w:p>
-    <w:p>
-      <w:pPr>
-        <w:rPr>
-          <w:rFonts w:eastAsia="宋体"/>
-          <w:color w:val="000000" w:themeColor="text1"/>
-          <w:sz w:val="22"/>
-          <w:szCs w:val="22"/>
-          <w:lang w:eastAsia="zh-CN"/>
-        </w:rPr>
-      </w:pPr>
-      <w:r>
-        <w:rPr>
-          <w:rFonts w:eastAsia="宋体"/>
-          <w:color w:val="000000" w:themeColor="text1"/>
-          <w:sz w:val="22"/>
-          <w:szCs w:val="22"/>
-          <w:lang w:eastAsia="zh-CN"/>
-        </w:rPr>
-        <w:t>aa-</w:t>
-      </w:r>
-      <w:proofErr w:type="spellStart"/>
-      <w:r>
-        <w:rPr>
-          <w:rFonts w:eastAsia="宋体"/>
-          <w:color w:val="000000" w:themeColor="text1"/>
-          <w:sz w:val="22"/>
-          <w:szCs w:val="22"/>
-          <w:lang w:eastAsia="zh-CN"/>
-        </w:rPr>
-        <w:t>api</w:t>
-      </w:r>
-      <w:proofErr w:type="spellEnd"/>
-      <w:r>
-        <w:rPr>
-          <w:rFonts w:eastAsia="宋体"/>
-          <w:color w:val="000000" w:themeColor="text1"/>
-          <w:sz w:val="22"/>
-          <w:szCs w:val="22"/>
-          <w:lang w:eastAsia="zh-CN"/>
-        </w:rPr>
-        <w:t>   </w:t>
-      </w:r>
-    </w:p>
-    <w:p>
-      <w:pPr>
-        <w:numPr>
-          <w:ilvl w:val="0"/>
-          <w:numId w:val="6"/>
-        </w:numPr>
-        <w:rPr>
-          <w:rFonts w:eastAsia="宋体"/>
-          <w:color w:val="000000" w:themeColor="text1"/>
-          <w:sz w:val="22"/>
-          <w:szCs w:val="22"/>
-          <w:lang w:eastAsia="zh-CN"/>
-        </w:rPr>
-      </w:pPr>
-      <w:r>
-        <w:rPr>
-          <w:rFonts w:eastAsia="宋体"/>
-          <w:color w:val="000000" w:themeColor="text1"/>
-          <w:sz w:val="22"/>
-          <w:szCs w:val="22"/>
-          <w:lang w:eastAsia="zh-CN"/>
-        </w:rPr>
-        <w:t>{</w:t>
-      </w:r>
-      <w:proofErr w:type="spellStart"/>
-      <w:r>
-        <w:rPr>
-          <w:rFonts w:eastAsia="宋体"/>
-          <w:color w:val="000000" w:themeColor="text1"/>
-          <w:sz w:val="22"/>
-          <w:szCs w:val="22"/>
-          <w:lang w:eastAsia="zh-CN"/>
-        </w:rPr>
-        <w:t>jiraAaApi</w:t>
-      </w:r>
-      <w:bookmarkStart w:id="5" w:name="OLE_LINK19"/>
-      <w:r>
-        <w:rPr>
-          <w:rFonts w:eastAsia="宋体"/>
-          <w:color w:val="000000" w:themeColor="text1"/>
-          <w:sz w:val="22"/>
-          <w:szCs w:val="22"/>
-          <w:lang w:eastAsia="zh-CN"/>
-        </w:rPr>
-        <w:t>RollBack</w:t>
-      </w:r>
-      <w:bookmarkEnd w:id="5"/>
-      <w:proofErr w:type="spellEnd"/>
-      <w:r>
-        <w:rPr>
-          <w:rFonts w:eastAsia="宋体"/>
-          <w:color w:val="000000" w:themeColor="text1"/>
-          <w:sz w:val="22"/>
-          <w:szCs w:val="22"/>
-          <w:lang w:eastAsia="zh-CN"/>
-        </w:rPr>
-        <w:t>}</w:t>
-      </w:r>
-      <w:r>
-        <w:rPr>
-          <w:rFonts w:eastAsia="宋体"/>
-          <w:color w:val="000000" w:themeColor="text1"/>
-          <w:sz w:val="22"/>
-          <w:szCs w:val="22"/>
-          <w:lang w:eastAsia="zh-CN"/>
-        </w:rPr>
-        <w:t xml:space="preserve">  </w:t>
-      </w:r>
-    </w:p>
-    <w:p>
-      <w:pPr>
-        <w:numPr>
-          <w:ilvl w:val="0"/>
-          <w:numId w:val="7"/>
-        </w:numPr>
-        <w:rPr>
-          <w:rFonts w:eastAsia="宋体"/>
-          <w:color w:val="000000" w:themeColor="text1"/>
-          <w:sz w:val="22"/>
-          <w:szCs w:val="22"/>
-          <w:lang w:eastAsia="zh-CN"/>
-        </w:rPr>
-      </w:pPr>
-      <w:r>
-        <w:rPr>
-          <w:rFonts w:eastAsia="宋体"/>
-          <w:color w:val="000000" w:themeColor="text1"/>
-          <w:sz w:val="22"/>
-          <w:szCs w:val="22"/>
-          <w:lang w:eastAsia="zh-CN"/>
-        </w:rPr>
-        <w:t>Click on “Start Deploy”   </w:t>
-      </w:r>
-    </w:p>
-    <w:p>
-      <w:pPr>
-        <w:numPr>
-          <w:ilvl w:val="0"/>
-          <w:numId w:val="8"/>
-        </w:numPr>
-        <w:rPr>
-          <w:rFonts w:eastAsia="宋体"/>
-          <w:color w:val="000000" w:themeColor="text1"/>
-          <w:sz w:val="22"/>
-          <w:szCs w:val="22"/>
-          <w:lang w:eastAsia="zh-CN"/>
-        </w:rPr>
-      </w:pPr>
-      <w:r>
-        <w:rPr>
-          <w:rFonts w:eastAsia="宋体"/>
-          <w:color w:val="000000" w:themeColor="text1"/>
-          <w:sz w:val="22"/>
-          <w:szCs w:val="22"/>
-          <w:lang w:eastAsia="zh-CN"/>
-        </w:rPr>
-        <w:t>The status will change to “DEPLOYING” after a while.   </w:t>
-      </w:r>
-    </w:p>
-    <w:p>
-      <w:pPr>
-        <w:rPr>
-          <w:rFonts w:eastAsia="宋体"/>
+        </w:rPr>
+      </w:pPr>
+      <w:r>
+        <w:rPr>
           <w:b/>
           <w:bCs/>
           <w:color w:val="000000" w:themeColor="text1"/>
           <w:sz w:val="22"/>
           <w:szCs w:val="22"/>
-          <w:lang w:eastAsia="zh-CN"/>
-        </w:rPr>
-      </w:pPr>
-      <w:r>
-        <w:rPr>
-          <w:rFonts w:eastAsia="宋体"/>
+        </w:rPr>
+        <w:t>aa-web</w:t>
+      </w:r>
+      <w:r>
+        <w:rPr>
+          <w:color w:val="000000" w:themeColor="text1"/>
+          <w:sz w:val="22"/>
+          <w:szCs w:val="22"/>
+        </w:rPr>
+        <w:t>   </w:t>
+      </w:r>
+    </w:p>
+    <w:p>
+      <w:pPr>
+        <w:pStyle w:val="af9"/>
+        <w:numPr>
+          <w:ilvl w:val="0"/>
+          <w:numId w:val="9"/>
+        </w:numPr>
+        <w:rPr>
+          <w:color w:val="000000" w:themeColor="text1"/>
+          <w:sz w:val="22"/>
+          <w:szCs w:val="22"/>
+        </w:rPr>
+      </w:pPr>
+      <w:r>
+        <w:rPr>
+          <w:color w:val="000000" w:themeColor="text1"/>
+          <w:sz w:val="22"/>
+          <w:szCs w:val="22"/>
+        </w:rPr>
+        <w:t>{</w:t>
+      </w:r>
+      <w:proofErr w:type="spellStart"/>
+      <w:r>
+        <w:rPr>
+          <w:color w:val="000000" w:themeColor="text1"/>
+          <w:sz w:val="22"/>
+          <w:szCs w:val="22"/>
+        </w:rPr>
+        <w:t>jiraAaWebRollBack</w:t>
+      </w:r>
+      <w:proofErr w:type="spellEnd"/>
+      <w:r>
+        <w:rPr>
+          <w:color w:val="000000" w:themeColor="text1"/>
+          <w:sz w:val="22"/>
+          <w:szCs w:val="22"/>
+        </w:rPr>
+        <w:t>}</w:t>
+      </w:r>
+      <w:r>
+        <w:rPr>
+          <w:color w:val="000000" w:themeColor="text1"/>
+          <w:sz w:val="22"/>
+          <w:szCs w:val="22"/>
+        </w:rPr>
+        <w:t xml:space="preserve"> </w:t>
+      </w:r>
+    </w:p>
+    <w:p>
+      <w:pPr>
+        <w:numPr>
+          <w:ilvl w:val="0"/>
+          <w:numId w:val="4"/>
+        </w:numPr>
+        <w:rPr>
+          <w:color w:val="000000" w:themeColor="text1"/>
+          <w:sz w:val="22"/>
+          <w:szCs w:val="22"/>
+        </w:rPr>
+      </w:pPr>
+      <w:r>
+        <w:rPr>
+          <w:color w:val="000000" w:themeColor="text1"/>
+          <w:sz w:val="22"/>
+          <w:szCs w:val="22"/>
+        </w:rPr>
+        <w:t>Click on “Start Deploy”   </w:t>
+      </w:r>
+    </w:p>
+    <w:p>
+      <w:pPr>
+        <w:numPr>
+          <w:ilvl w:val="0"/>
+          <w:numId w:val="5"/>
+        </w:numPr>
+        <w:rPr>
+          <w:color w:val="000000" w:themeColor="text1"/>
+          <w:sz w:val="22"/>
+          <w:szCs w:val="22"/>
+        </w:rPr>
+      </w:pPr>
+      <w:r>
+        <w:rPr>
+          <w:color w:val="000000" w:themeColor="text1"/>
+          <w:sz w:val="22"/>
+          <w:szCs w:val="22"/>
+        </w:rPr>
+        <w:t>The status will change to “DEPLOYING” after a while.   </w:t>
+      </w:r>
+    </w:p>
+    <w:p>
+      <w:pPr>
+        <w:rPr>
+          <w:color w:val="000000" w:themeColor="text1"/>
+          <w:sz w:val="22"/>
+          <w:szCs w:val="22"/>
+        </w:rPr>
+      </w:pPr>
+      <w:r>
+        <w:rPr>
           <w:b/>
           <w:bCs/>
           <w:color w:val="000000" w:themeColor="text1"/>
           <w:sz w:val="22"/>
           <w:szCs w:val="22"/>
-          <w:lang w:eastAsia="zh-CN"/>
-        </w:rPr>
-        <w:t> </w:t>
-      </w:r>
-    </w:p>
-    <w:p>
-      <w:pPr>
-        <w:rPr>
-          <w:rFonts w:eastAsia="宋体"/>
+        </w:rPr>
+        <w:t>aa-</w:t>
+      </w:r>
+      <w:proofErr w:type="spellStart"/>
+      <w:r>
+        <w:rPr>
           <w:b/>
           <w:bCs/>
           <w:color w:val="000000" w:themeColor="text1"/>
           <w:sz w:val="22"/>
           <w:szCs w:val="22"/>
-          <w:lang w:eastAsia="zh-CN"/>
-        </w:rPr>
-      </w:pPr>
-      <w:r>
-        <w:rPr>
-          <w:rFonts w:eastAsia="宋体"/>
+        </w:rPr>
+        <w:t>api</w:t>
+      </w:r>
+      <w:proofErr w:type="spellEnd"/>
+      <w:r>
+        <w:rPr>
+          <w:color w:val="000000" w:themeColor="text1"/>
+          <w:sz w:val="22"/>
+          <w:szCs w:val="22"/>
+        </w:rPr>
+        <w:t>   </w:t>
+      </w:r>
+    </w:p>
+    <w:p>
+      <w:pPr>
+        <w:numPr>
+          <w:ilvl w:val="0"/>
+          <w:numId w:val="6"/>
+        </w:numPr>
+        <w:rPr>
+          <w:color w:val="000000" w:themeColor="text1"/>
+          <w:sz w:val="22"/>
+          <w:szCs w:val="22"/>
+        </w:rPr>
+      </w:pPr>
+      <w:r>
+        <w:rPr>
+          <w:rFonts w:ascii="Times New Roman" w:eastAsia="PMingLiU" w:hAnsi="Times New Roman" w:cs="Times New Roman"/>
+          <w:color w:val="000000" w:themeColor="text1"/>
+          <w:sz w:val="22"/>
+          <w:szCs w:val="22"/>
+          <w:lang w:eastAsia="zh-TW"/>
+        </w:rPr>
+        <w:t>{</w:t>
+      </w:r>
+      <w:proofErr w:type="spellStart"/>
+      <w:r>
+        <w:rPr>
+          <w:rFonts w:ascii="Times New Roman" w:eastAsia="PMingLiU" w:hAnsi="Times New Roman" w:cs="Times New Roman"/>
+          <w:color w:val="000000" w:themeColor="text1"/>
+          <w:sz w:val="22"/>
+          <w:szCs w:val="22"/>
+          <w:lang w:eastAsia="zh-TW"/>
+        </w:rPr>
+        <w:t>jiraAaApi</w:t>
+      </w:r>
+      <w:bookmarkStart w:id="6" w:name="OLE_LINK19"/>
+      <w:r>
+        <w:rPr>
+          <w:rFonts w:ascii="Times New Roman" w:eastAsia="PMingLiU" w:hAnsi="Times New Roman" w:cs="Times New Roman"/>
+          <w:color w:val="000000" w:themeColor="text1"/>
+          <w:sz w:val="22"/>
+          <w:szCs w:val="22"/>
+          <w:lang w:eastAsia="zh-TW"/>
+        </w:rPr>
+        <w:t>RollBack</w:t>
+      </w:r>
+      <w:bookmarkEnd w:id="6"/>
+      <w:proofErr w:type="spellEnd"/>
+      <w:r>
+        <w:rPr>
+          <w:color w:val="000000" w:themeColor="text1"/>
+          <w:sz w:val="22"/>
+          <w:szCs w:val="22"/>
+        </w:rPr>
+        <w:t>}</w:t>
+      </w:r>
+      <w:r>
+        <w:rPr>
+          <w:color w:val="000000" w:themeColor="text1"/>
+          <w:sz w:val="22"/>
+          <w:szCs w:val="22"/>
+        </w:rPr>
+        <w:t xml:space="preserve">  </w:t>
+      </w:r>
+    </w:p>
+    <w:p>
+      <w:pPr>
+        <w:numPr>
+          <w:ilvl w:val="0"/>
+          <w:numId w:val="7"/>
+        </w:numPr>
+        <w:rPr>
+          <w:color w:val="000000" w:themeColor="text1"/>
+          <w:sz w:val="22"/>
+          <w:szCs w:val="22"/>
+        </w:rPr>
+      </w:pPr>
+      <w:r>
+        <w:rPr>
+          <w:color w:val="000000" w:themeColor="text1"/>
+          <w:sz w:val="22"/>
+          <w:szCs w:val="22"/>
+        </w:rPr>
+        <w:t>Click on “Start Deploy”   </w:t>
+      </w:r>
+    </w:p>
+    <w:p>
+      <w:pPr>
+        <w:numPr>
+          <w:ilvl w:val="0"/>
+          <w:numId w:val="8"/>
+        </w:numPr>
+        <w:rPr>
+          <w:color w:val="000000" w:themeColor="text1"/>
+          <w:sz w:val="22"/>
+          <w:szCs w:val="22"/>
+        </w:rPr>
+      </w:pPr>
+      <w:r>
+        <w:rPr>
+          <w:color w:val="000000" w:themeColor="text1"/>
+          <w:sz w:val="22"/>
+          <w:szCs w:val="22"/>
+        </w:rPr>
+        <w:t>The status will change to “DEPLOYING” after a while.   </w:t>
+      </w:r>
+    </w:p>
+    <w:p>
+      <w:pPr>
+        <w:rPr>
           <w:b/>
           <w:bCs/>
           <w:color w:val="000000" w:themeColor="text1"/>
           <w:sz w:val="22"/>
           <w:szCs w:val="22"/>
-          <w:lang w:eastAsia="zh-CN"/>
-        </w:rPr>
-        <w:t> </w:t>
-      </w:r>
-    </w:p>
-    <w:p>
-      <w:pPr>
-        <w:rPr>
-          <w:rFonts w:eastAsia="宋体"/>
+        </w:rPr>
+      </w:pPr>
+      <w:r>
+        <w:rPr>
           <w:b/>
           <w:bCs/>
           <w:color w:val="000000" w:themeColor="text1"/>
           <w:sz w:val="22"/>
           <w:szCs w:val="22"/>
-          <w:lang w:eastAsia="zh-CN"/>
-        </w:rPr>
-      </w:pPr>
-      <w:r>
-        <w:rPr>
-          <w:rFonts w:eastAsia="宋体"/>
+        </w:rPr>
+        <w:t> </w:t>
+      </w:r>
+    </w:p>
+    <w:p>
+      <w:pPr>
+        <w:rPr>
           <w:b/>
           <w:bCs/>
           <w:color w:val="000000" w:themeColor="text1"/>
           <w:sz w:val="22"/>
           <w:szCs w:val="22"/>
-          <w:lang w:eastAsia="zh-CN"/>
-        </w:rPr>
-        <w:t>2.</w:t>
-      </w:r>
-      <w:r>
-        <w:rPr>
-          <w:rFonts w:eastAsia="宋体"/>
+        </w:rPr>
+      </w:pPr>
+      <w:r>
+        <w:rPr>
           <w:b/>
           <w:bCs/>
           <w:color w:val="000000" w:themeColor="text1"/>
           <w:sz w:val="22"/>
           <w:szCs w:val="22"/>
-          <w:lang w:eastAsia="zh-CN"/>
-        </w:rPr>
-        <w:tab/>
-        <w:t>AA IT verify the related objects.  </w:t>
+        </w:rPr>
+        <w:t> </w:t>
       </w:r>
     </w:p>
     <w:p>
       <w:pPr>
         <w:rPr>
-          <w:rFonts w:eastAsia="宋体"/>
           <w:b/>
           <w:bCs/>
           <w:color w:val="000000" w:themeColor="text1"/>
           <w:sz w:val="22"/>
           <w:szCs w:val="22"/>
-          <w:lang w:eastAsia="zh-CN"/>
-        </w:rPr>
-      </w:pPr>
+        </w:rPr>
+      </w:pPr>
+      <w:r>
+        <w:rPr>
+          <w:b/>
+          <w:bCs/>
+          <w:color w:val="000000" w:themeColor="text1"/>
+          <w:sz w:val="22"/>
+          <w:szCs w:val="22"/>
+        </w:rPr>
+        <w:t>2.</w:t>
+      </w:r>
+      <w:r>
+        <w:rPr>
+          <w:b/>
+          <w:bCs/>
+          <w:color w:val="000000" w:themeColor="text1"/>
+          <w:sz w:val="22"/>
+          <w:szCs w:val="22"/>
+        </w:rPr>
+        <w:tab/>
+        <w:t>AA IT verify the related objects.  </w:t>
+      </w:r>
     </w:p>
     <w:p>
       <w:pPr>
         <w:rPr>
-          <w:rFonts w:eastAsia="宋体"/>
+          <w:b/>
+          <w:bCs/>
+          <w:color w:val="000000" w:themeColor="text1"/>
+          <w:sz w:val="22"/>
+          <w:szCs w:val="22"/>
         </w:rPr>
       </w:pPr>
     </w:p>
+    <w:p/>
     <w:p>
       <w:pPr>
         <w:jc w:val="center"/>
@@ -6751,6 +6526,92 @@
     </w:lvl>
   </w:abstractNum>
   <w:abstractNum w:abstractNumId="2" w15:restartNumberingAfterBreak="0">
+    <w:nsid w:val="178E4978"/>
+    <w:multiLevelType w:val="hybridMultilevel"/>
+    <w:tmpl w:val="779ADB72"/>
+    <w:lvl w:ilvl="0" w:tplc="0409000F">
+      <w:start w:val="1"/>
+      <w:numFmt w:val="decimal"/>
+      <w:lvlText w:val="%1."/>
+      <w:lvlJc w:val="left"/>
+      <w:pPr>
+        <w:ind w:left="800" w:hanging="440"/>
+      </w:pPr>
+    </w:lvl>
+    <w:lvl w:ilvl="1" w:tplc="04090019" w:tentative="1">
+      <w:start w:val="1"/>
+      <w:numFmt w:val="lowerLetter"/>
+      <w:lvlText w:val="%2)"/>
+      <w:lvlJc w:val="left"/>
+      <w:pPr>
+        <w:ind w:left="1240" w:hanging="440"/>
+      </w:pPr>
+    </w:lvl>
+    <w:lvl w:ilvl="2" w:tplc="0409001B" w:tentative="1">
+      <w:start w:val="1"/>
+      <w:numFmt w:val="lowerRoman"/>
+      <w:lvlText w:val="%3."/>
+      <w:lvlJc w:val="right"/>
+      <w:pPr>
+        <w:ind w:left="1680" w:hanging="440"/>
+      </w:pPr>
+    </w:lvl>
+    <w:lvl w:ilvl="3" w:tplc="0409000F" w:tentative="1">
+      <w:start w:val="1"/>
+      <w:numFmt w:val="decimal"/>
+      <w:lvlText w:val="%4."/>
+      <w:lvlJc w:val="left"/>
+      <w:pPr>
+        <w:ind w:left="2120" w:hanging="440"/>
+      </w:pPr>
+    </w:lvl>
+    <w:lvl w:ilvl="4" w:tplc="04090019" w:tentative="1">
+      <w:start w:val="1"/>
+      <w:numFmt w:val="lowerLetter"/>
+      <w:lvlText w:val="%5)"/>
+      <w:lvlJc w:val="left"/>
+      <w:pPr>
+        <w:ind w:left="2560" w:hanging="440"/>
+      </w:pPr>
+    </w:lvl>
+    <w:lvl w:ilvl="5" w:tplc="0409001B" w:tentative="1">
+      <w:start w:val="1"/>
+      <w:numFmt w:val="lowerRoman"/>
+      <w:lvlText w:val="%6."/>
+      <w:lvlJc w:val="right"/>
+      <w:pPr>
+        <w:ind w:left="3000" w:hanging="440"/>
+      </w:pPr>
+    </w:lvl>
+    <w:lvl w:ilvl="6" w:tplc="0409000F" w:tentative="1">
+      <w:start w:val="1"/>
+      <w:numFmt w:val="decimal"/>
+      <w:lvlText w:val="%7."/>
+      <w:lvlJc w:val="left"/>
+      <w:pPr>
+        <w:ind w:left="3440" w:hanging="440"/>
+      </w:pPr>
+    </w:lvl>
+    <w:lvl w:ilvl="7" w:tplc="04090019" w:tentative="1">
+      <w:start w:val="1"/>
+      <w:numFmt w:val="lowerLetter"/>
+      <w:lvlText w:val="%8)"/>
+      <w:lvlJc w:val="left"/>
+      <w:pPr>
+        <w:ind w:left="3880" w:hanging="440"/>
+      </w:pPr>
+    </w:lvl>
+    <w:lvl w:ilvl="8" w:tplc="0409001B" w:tentative="1">
+      <w:start w:val="1"/>
+      <w:numFmt w:val="lowerRoman"/>
+      <w:lvlText w:val="%9."/>
+      <w:lvlJc w:val="right"/>
+      <w:pPr>
+        <w:ind w:left="4320" w:hanging="440"/>
+      </w:pPr>
+    </w:lvl>
+  </w:abstractNum>
+  <w:abstractNum w:abstractNumId="3" w15:restartNumberingAfterBreak="0">
     <w:nsid w:val="1AE02A35"/>
     <w:multiLevelType w:val="multilevel"/>
     <w:tmpl w:val="F6FCE5CA"/>
@@ -6863,7 +6724,7 @@
       </w:pPr>
     </w:lvl>
   </w:abstractNum>
-  <w:abstractNum w:abstractNumId="3" w15:restartNumberingAfterBreak="0">
+  <w:abstractNum w:abstractNumId="4" w15:restartNumberingAfterBreak="0">
     <w:nsid w:val="1C03588C"/>
     <w:multiLevelType w:val="multilevel"/>
     <w:tmpl w:val="5B8A22EE"/>
@@ -6976,7 +6837,7 @@
       </w:pPr>
     </w:lvl>
   </w:abstractNum>
-  <w:abstractNum w:abstractNumId="4" w15:restartNumberingAfterBreak="0">
+  <w:abstractNum w:abstractNumId="5" w15:restartNumberingAfterBreak="0">
     <w:nsid w:val="300E3E5C"/>
     <w:multiLevelType w:val="multilevel"/>
     <w:tmpl w:val="440CE6F0"/>
@@ -7089,7 +6950,7 @@
       </w:pPr>
     </w:lvl>
   </w:abstractNum>
-  <w:abstractNum w:abstractNumId="5" w15:restartNumberingAfterBreak="0">
+  <w:abstractNum w:abstractNumId="6" w15:restartNumberingAfterBreak="0">
     <w:nsid w:val="36842B9E"/>
     <w:multiLevelType w:val="multilevel"/>
     <w:tmpl w:val="5C6E55BC"/>
@@ -7229,7 +7090,7 @@
       </w:rPr>
     </w:lvl>
   </w:abstractNum>
-  <w:abstractNum w:abstractNumId="6" w15:restartNumberingAfterBreak="0">
+  <w:abstractNum w:abstractNumId="7" w15:restartNumberingAfterBreak="0">
     <w:nsid w:val="604C7C50"/>
     <w:multiLevelType w:val="multilevel"/>
     <w:tmpl w:val="C2586346"/>
@@ -7342,7 +7203,7 @@
       </w:pPr>
     </w:lvl>
   </w:abstractNum>
-  <w:abstractNum w:abstractNumId="7" w15:restartNumberingAfterBreak="0">
+  <w:abstractNum w:abstractNumId="8" w15:restartNumberingAfterBreak="0">
     <w:nsid w:val="6A1912B6"/>
     <w:multiLevelType w:val="multilevel"/>
     <w:tmpl w:val="FA508758"/>
@@ -7456,28 +7317,31 @@
     </w:lvl>
   </w:abstractNum>
   <w:num w:numId="1" w16cid:durableId="59713602">
-    <w:abstractNumId w:val="5"/>
+    <w:abstractNumId w:val="6"/>
   </w:num>
   <w:num w:numId="2" w16cid:durableId="1835148139">
-    <w:abstractNumId w:val="6"/>
+    <w:abstractNumId w:val="7"/>
   </w:num>
   <w:num w:numId="3" w16cid:durableId="829752030">
     <w:abstractNumId w:val="1"/>
   </w:num>
   <w:num w:numId="4" w16cid:durableId="1181162594">
-    <w:abstractNumId w:val="3"/>
+    <w:abstractNumId w:val="4"/>
   </w:num>
   <w:num w:numId="5" w16cid:durableId="8262406">
-    <w:abstractNumId w:val="2"/>
+    <w:abstractNumId w:val="3"/>
   </w:num>
   <w:num w:numId="6" w16cid:durableId="1940944566">
     <w:abstractNumId w:val="0"/>
   </w:num>
   <w:num w:numId="7" w16cid:durableId="1335189057">
-    <w:abstractNumId w:val="7"/>
+    <w:abstractNumId w:val="8"/>
   </w:num>
   <w:num w:numId="8" w16cid:durableId="320038351">
-    <w:abstractNumId w:val="4"/>
+    <w:abstractNumId w:val="5"/>
+  </w:num>
+  <w:num w:numId="9" w16cid:durableId="1629779282">
+    <w:abstractNumId w:val="2"/>
   </w:num>
   <w:numIdMacAtCleanup w:val="8"/>
 </w:numbering>
@@ -7869,11 +7733,11 @@
   <w:style w:type="paragraph" w:default="1" w:styleId="a">
     <w:name w:val="Normal"/>
     <w:qFormat/>
-    <w:rsid w:val="008122DD"/>
+    <w:rsid w:val="00C53525"/>
     <w:rPr>
+      <w:rFonts w:ascii="宋体" w:eastAsia="宋体" w:hAnsi="宋体" w:cs="宋体"/>
       <w:sz w:val="24"/>
       <w:szCs w:val="24"/>
-      <w:lang w:eastAsia="zh-TW"/>
     </w:rPr>
   </w:style>
   <w:style w:type="paragraph" w:styleId="1">
@@ -7893,9 +7757,11 @@
       <w:outlineLvl w:val="0"/>
     </w:pPr>
     <w:rPr>
+      <w:rFonts w:ascii="Times New Roman" w:eastAsia="PMingLiU" w:hAnsi="Times New Roman" w:cs="Times New Roman"/>
       <w:spacing w:val="-3"/>
       <w:kern w:val="2"/>
       <w:sz w:val="32"/>
+      <w:lang w:eastAsia="zh-TW"/>
     </w:rPr>
   </w:style>
   <w:style w:type="paragraph" w:styleId="2">
@@ -7911,13 +7777,14 @@
       <w:outlineLvl w:val="1"/>
     </w:pPr>
     <w:rPr>
-      <w:rFonts w:ascii="Arial" w:hAnsi="Arial" w:cs="Arial"/>
+      <w:rFonts w:ascii="Arial" w:eastAsia="PMingLiU" w:hAnsi="Arial" w:cs="Arial"/>
       <w:b/>
       <w:bCs/>
       <w:i/>
       <w:iCs/>
       <w:sz w:val="28"/>
       <w:szCs w:val="28"/>
+      <w:lang w:eastAsia="zh-TW"/>
     </w:rPr>
   </w:style>
   <w:style w:type="paragraph" w:styleId="3">
@@ -7933,11 +7800,12 @@
       <w:outlineLvl w:val="2"/>
     </w:pPr>
     <w:rPr>
-      <w:rFonts w:ascii="Arial" w:hAnsi="Arial" w:cs="Arial"/>
+      <w:rFonts w:ascii="Arial" w:eastAsia="PMingLiU" w:hAnsi="Arial" w:cs="Arial"/>
       <w:b/>
       <w:bCs/>
       <w:sz w:val="26"/>
       <w:szCs w:val="26"/>
+      <w:lang w:eastAsia="zh-TW"/>
     </w:rPr>
   </w:style>
   <w:style w:type="paragraph" w:styleId="4">
@@ -7953,10 +7821,12 @@
       <w:outlineLvl w:val="3"/>
     </w:pPr>
     <w:rPr>
+      <w:rFonts w:ascii="Times New Roman" w:eastAsia="PMingLiU" w:hAnsi="Times New Roman" w:cs="Times New Roman"/>
       <w:b/>
       <w:bCs/>
       <w:sz w:val="28"/>
       <w:szCs w:val="28"/>
+      <w:lang w:eastAsia="zh-TW"/>
     </w:rPr>
   </w:style>
   <w:style w:type="paragraph" w:styleId="5">
@@ -7976,6 +7846,7 @@
     <w:rPr>
       <w:rFonts w:asciiTheme="majorHAnsi" w:eastAsiaTheme="majorEastAsia" w:hAnsiTheme="majorHAnsi" w:cstheme="majorBidi"/>
       <w:color w:val="243F60" w:themeColor="accent1" w:themeShade="7F"/>
+      <w:lang w:eastAsia="zh-TW"/>
     </w:rPr>
   </w:style>
   <w:style w:type="paragraph" w:styleId="9">
@@ -7989,9 +7860,10 @@
       <w:outlineLvl w:val="8"/>
     </w:pPr>
     <w:rPr>
-      <w:rFonts w:ascii="Arial" w:hAnsi="Arial" w:cs="Arial"/>
+      <w:rFonts w:ascii="Arial" w:eastAsia="PMingLiU" w:hAnsi="Arial" w:cs="Arial"/>
       <w:sz w:val="22"/>
       <w:szCs w:val="22"/>
+      <w:lang w:eastAsia="zh-TW"/>
     </w:rPr>
   </w:style>
   <w:style w:type="character" w:default="1" w:styleId="a0">
@@ -8036,9 +7908,11 @@
       <w:snapToGrid w:val="0"/>
     </w:pPr>
     <w:rPr>
+      <w:rFonts w:ascii="Times New Roman" w:eastAsia="PMingLiU" w:hAnsi="Times New Roman" w:cs="Times New Roman"/>
       <w:kern w:val="2"/>
       <w:sz w:val="20"/>
       <w:szCs w:val="20"/>
+      <w:lang w:eastAsia="zh-TW"/>
     </w:rPr>
   </w:style>
   <w:style w:type="paragraph" w:styleId="a5">
@@ -8055,10 +7929,11 @@
       <w:textAlignment w:val="baseline"/>
     </w:pPr>
     <w:rPr>
-      <w:rFonts w:eastAsia="文鼎中楷"/>
+      <w:rFonts w:ascii="Times New Roman" w:eastAsia="文鼎中楷" w:hAnsi="Times New Roman" w:cs="Times New Roman"/>
       <w:bCs/>
       <w:sz w:val="36"/>
       <w:szCs w:val="20"/>
+      <w:lang w:eastAsia="zh-TW"/>
     </w:rPr>
   </w:style>
   <w:style w:type="paragraph" w:styleId="a7">
@@ -8089,11 +7964,10 @@
       <w:jc w:val="center"/>
     </w:pPr>
     <w:rPr>
-      <w:rFonts w:ascii="Arial" w:eastAsia="宋体" w:hAnsi="Arial"/>
+      <w:rFonts w:ascii="Arial" w:hAnsi="Arial" w:cs="Times New Roman"/>
       <w:b/>
       <w:sz w:val="16"/>
       <w:szCs w:val="20"/>
-      <w:lang w:eastAsia="zh-CN"/>
     </w:rPr>
   </w:style>
   <w:style w:type="paragraph" w:styleId="21">
@@ -8103,6 +7977,10 @@
     <w:pPr>
       <w:spacing w:after="120" w:line="480" w:lineRule="auto"/>
     </w:pPr>
+    <w:rPr>
+      <w:rFonts w:ascii="Times New Roman" w:eastAsia="PMingLiU" w:hAnsi="Times New Roman" w:cs="Times New Roman"/>
+      <w:lang w:eastAsia="zh-TW"/>
+    </w:rPr>
   </w:style>
   <w:style w:type="paragraph" w:styleId="a9">
     <w:name w:val="Body Text Indent"/>
@@ -8114,7 +7992,9 @@
       <w:ind w:left="283"/>
     </w:pPr>
     <w:rPr>
+      <w:rFonts w:ascii="Times New Roman" w:eastAsia="PMingLiU" w:hAnsi="Times New Roman" w:cs="Times New Roman"/>
       <w:kern w:val="2"/>
+      <w:lang w:eastAsia="zh-TW"/>
     </w:rPr>
   </w:style>
   <w:style w:type="paragraph" w:styleId="22">
@@ -8127,7 +8007,9 @@
       <w:ind w:left="283"/>
     </w:pPr>
     <w:rPr>
+      <w:rFonts w:ascii="Times New Roman" w:eastAsia="PMingLiU" w:hAnsi="Times New Roman" w:cs="Times New Roman"/>
       <w:kern w:val="2"/>
+      <w:lang w:eastAsia="zh-TW"/>
     </w:rPr>
   </w:style>
   <w:style w:type="paragraph" w:styleId="aa">
@@ -8141,7 +8023,7 @@
       <w:ind w:left="1440" w:right="-720" w:hanging="720"/>
     </w:pPr>
     <w:rPr>
-      <w:rFonts w:ascii="Arial" w:eastAsia="Times New Roman" w:hAnsi="Arial"/>
+      <w:rFonts w:ascii="Arial" w:eastAsia="Times New Roman" w:hAnsi="Arial" w:cs="Times New Roman"/>
       <w:sz w:val="18"/>
       <w:szCs w:val="20"/>
       <w:lang w:eastAsia="en-US"/>
@@ -8163,6 +8045,10 @@
         <w:tab w:val="right" w:pos="8640"/>
       </w:tabs>
     </w:pPr>
+    <w:rPr>
+      <w:rFonts w:ascii="Times New Roman" w:eastAsia="PMingLiU" w:hAnsi="Times New Roman" w:cs="Times New Roman"/>
+      <w:lang w:eastAsia="zh-TW"/>
+    </w:rPr>
   </w:style>
   <w:style w:type="paragraph" w:styleId="ae">
     <w:name w:val="Balloon Text"/>
@@ -8191,8 +8077,10 @@
     <w:semiHidden/>
     <w:rsid w:val="00D52173"/>
     <w:rPr>
+      <w:rFonts w:ascii="Times New Roman" w:eastAsia="PMingLiU" w:hAnsi="Times New Roman" w:cs="Times New Roman"/>
       <w:sz w:val="20"/>
       <w:szCs w:val="20"/>
+      <w:lang w:eastAsia="zh-TW"/>
     </w:rPr>
   </w:style>
   <w:style w:type="paragraph" w:styleId="af1">
@@ -8243,9 +8131,10 @@
     <w:link w:val="af6"/>
     <w:rsid w:val="007961C9"/>
     <w:rPr>
-      <w:rFonts w:ascii="Tahoma" w:hAnsi="Tahoma" w:cs="Tahoma"/>
+      <w:rFonts w:ascii="Tahoma" w:eastAsia="PMingLiU" w:hAnsi="Tahoma" w:cs="Tahoma"/>
       <w:sz w:val="16"/>
       <w:szCs w:val="16"/>
+      <w:lang w:eastAsia="zh-TW"/>
     </w:rPr>
   </w:style>
   <w:style w:type="character" w:customStyle="1" w:styleId="af6">
@@ -8265,9 +8154,9 @@
     <w:link w:val="af8"/>
     <w:rsid w:val="00BB55E5"/>
     <w:rPr>
+      <w:rFonts w:ascii="Times New Roman" w:eastAsia="PMingLiU" w:hAnsi="Times New Roman" w:cs="Times New Roman"/>
       <w:sz w:val="20"/>
       <w:szCs w:val="20"/>
-      <w:lang w:eastAsia="zh-CN"/>
     </w:rPr>
   </w:style>
   <w:style w:type="character" w:customStyle="1" w:styleId="af8">
@@ -8311,6 +8200,10 @@
       <w:ind w:left="720"/>
       <w:contextualSpacing/>
     </w:pPr>
+    <w:rPr>
+      <w:rFonts w:ascii="Times New Roman" w:eastAsia="PMingLiU" w:hAnsi="Times New Roman" w:cs="Times New Roman"/>
+      <w:lang w:eastAsia="zh-TW"/>
+    </w:rPr>
   </w:style>
   <w:style w:type="character" w:styleId="afb">
     <w:name w:val="FollowedHyperlink"/>
@@ -8338,8 +8231,9 @@
       <w:textAlignment w:val="center"/>
     </w:pPr>
     <w:rPr>
-      <w:rFonts w:eastAsia="Times New Roman"/>
+      <w:rFonts w:ascii="Times New Roman" w:eastAsia="Times New Roman" w:hAnsi="Times New Roman" w:cs="Times New Roman"/>
       <w:color w:val="000000"/>
+      <w:lang w:eastAsia="zh-TW"/>
     </w:rPr>
   </w:style>
   <w:style w:type="paragraph" w:customStyle="1" w:styleId="xl64">
@@ -8360,6 +8254,7 @@
       <w:rFonts w:ascii="Arial" w:eastAsia="Times New Roman" w:hAnsi="Arial" w:cs="Arial"/>
       <w:sz w:val="18"/>
       <w:szCs w:val="18"/>
+      <w:lang w:eastAsia="zh-TW"/>
     </w:rPr>
   </w:style>
   <w:style w:type="paragraph" w:customStyle="1" w:styleId="xl65">
@@ -8376,7 +8271,8 @@
       <w:spacing w:before="100" w:beforeAutospacing="1" w:after="100" w:afterAutospacing="1"/>
     </w:pPr>
     <w:rPr>
-      <w:rFonts w:eastAsia="Times New Roman"/>
+      <w:rFonts w:ascii="Times New Roman" w:eastAsia="Times New Roman" w:hAnsi="Times New Roman" w:cs="Times New Roman"/>
+      <w:lang w:eastAsia="zh-TW"/>
     </w:rPr>
   </w:style>
   <w:style w:type="paragraph" w:styleId="TOC">
@@ -8418,6 +8314,10 @@
     <w:pPr>
       <w:spacing w:after="100"/>
     </w:pPr>
+    <w:rPr>
+      <w:rFonts w:ascii="Times New Roman" w:eastAsia="PMingLiU" w:hAnsi="Times New Roman" w:cs="Times New Roman"/>
+      <w:lang w:eastAsia="zh-TW"/>
+    </w:rPr>
   </w:style>
   <w:style w:type="paragraph" w:styleId="TOC3">
     <w:name w:val="toc 3"/>
@@ -8430,6 +8330,10 @@
       <w:spacing w:after="100"/>
       <w:ind w:left="480"/>
     </w:pPr>
+    <w:rPr>
+      <w:rFonts w:ascii="Times New Roman" w:eastAsia="PMingLiU" w:hAnsi="Times New Roman" w:cs="Times New Roman"/>
+      <w:lang w:eastAsia="zh-TW"/>
+    </w:rPr>
   </w:style>
   <w:style w:type="paragraph" w:customStyle="1" w:styleId="xl66">
     <w:name w:val="xl66"/>
@@ -8445,7 +8349,8 @@
       <w:spacing w:before="100" w:beforeAutospacing="1" w:after="100" w:afterAutospacing="1"/>
     </w:pPr>
     <w:rPr>
-      <w:rFonts w:eastAsia="Times New Roman"/>
+      <w:rFonts w:ascii="Times New Roman" w:eastAsia="Times New Roman" w:hAnsi="Times New Roman" w:cs="Times New Roman"/>
+      <w:lang w:eastAsia="zh-TW"/>
     </w:rPr>
   </w:style>
   <w:style w:type="paragraph" w:customStyle="1" w:styleId="xl67">
@@ -8466,6 +8371,7 @@
       <w:color w:val="000000"/>
       <w:sz w:val="18"/>
       <w:szCs w:val="18"/>
+      <w:lang w:eastAsia="zh-TW"/>
     </w:rPr>
   </w:style>
   <w:style w:type="paragraph" w:styleId="afc">
@@ -8534,6 +8440,10 @@
       <w:spacing w:after="100"/>
       <w:ind w:left="240"/>
     </w:pPr>
+    <w:rPr>
+      <w:rFonts w:ascii="Times New Roman" w:eastAsia="PMingLiU" w:hAnsi="Times New Roman" w:cs="Times New Roman"/>
+      <w:lang w:eastAsia="zh-TW"/>
+    </w:rPr>
   </w:style>
   <w:style w:type="paragraph" w:styleId="afd">
     <w:name w:val="Revision"/>
@@ -8570,7 +8480,8 @@
       <w:spacing w:before="100" w:beforeAutospacing="1" w:after="100" w:afterAutospacing="1"/>
     </w:pPr>
     <w:rPr>
-      <w:rFonts w:eastAsiaTheme="minorEastAsia"/>
+      <w:rFonts w:ascii="Times New Roman" w:eastAsiaTheme="minorEastAsia" w:hAnsi="Times New Roman" w:cs="Times New Roman"/>
+      <w:lang w:eastAsia="zh-TW"/>
     </w:rPr>
   </w:style>
   <w:style w:type="character" w:customStyle="1" w:styleId="a4">
@@ -8845,8 +8756,7 @@
       <w:spacing w:before="100" w:beforeAutospacing="1" w:after="100" w:afterAutospacing="1"/>
     </w:pPr>
     <w:rPr>
-      <w:rFonts w:eastAsia="Times New Roman"/>
-      <w:lang w:eastAsia="zh-CN"/>
+      <w:rFonts w:ascii="Times New Roman" w:eastAsia="Times New Roman" w:hAnsi="Times New Roman" w:cs="Times New Roman"/>
     </w:rPr>
   </w:style>
   <w:style w:type="character" w:styleId="HTML">
@@ -8984,6 +8894,14 @@
     <w:pitch w:val="variable"/>
     <w:sig w:usb0="A00002FF" w:usb1="28CFFCFA" w:usb2="00000016" w:usb3="00000000" w:csb0="00100001" w:csb1="00000000"/>
   </w:font>
+  <w:font w:name="宋体">
+    <w:altName w:val="SimSun"/>
+    <w:panose1 w:val="02010600030101010101"/>
+    <w:charset w:val="86"/>
+    <w:family w:val="auto"/>
+    <w:pitch w:val="variable"/>
+    <w:sig w:usb0="00000203" w:usb1="288F0000" w:usb2="00000016" w:usb3="00000000" w:csb0="00040001" w:csb1="00000000"/>
+  </w:font>
   <w:font w:name="Arial">
     <w:panose1 w:val="020B0604020202020204"/>
     <w:charset w:val="00"/>
@@ -9005,14 +8923,6 @@
     <w:family w:val="modern"/>
     <w:pitch w:val="fixed"/>
     <w:sig w:usb0="00000001" w:usb1="08080000" w:usb2="00000010" w:usb3="00000000" w:csb0="00100000" w:csb1="00000000"/>
-  </w:font>
-  <w:font w:name="宋体">
-    <w:altName w:val="SimSun"/>
-    <w:panose1 w:val="02010600030101010101"/>
-    <w:charset w:val="86"/>
-    <w:family w:val="auto"/>
-    <w:pitch w:val="variable"/>
-    <w:sig w:usb0="00000203" w:usb1="288F0000" w:usb2="00000016" w:usb3="00000000" w:csb0="00040001" w:csb1="00000000"/>
   </w:font>
   <w:font w:name="Tahoma">
     <w:panose1 w:val="020B0604030504040204"/>
@@ -9117,6 +9027,7 @@
     <w:rsid w:val="001C354A"/>
     <w:rsid w:val="001C3987"/>
     <w:rsid w:val="001D57CD"/>
+    <w:rsid w:val="001F0DC4"/>
     <w:rsid w:val="001F405C"/>
     <w:rsid w:val="001F56DE"/>
     <w:rsid w:val="00231A8F"/>
@@ -9262,6 +9173,7 @@
     <w:rsid w:val="00D43E67"/>
     <w:rsid w:val="00D46C71"/>
     <w:rsid w:val="00D6691C"/>
+    <w:rsid w:val="00D7288B"/>
     <w:rsid w:val="00D77DE6"/>
     <w:rsid w:val="00DD553A"/>
     <w:rsid w:val="00DE2273"/>
@@ -9285,10 +9197,12 @@
     <w:rsid w:val="00EF79B2"/>
     <w:rsid w:val="00F03F5D"/>
     <w:rsid w:val="00F16CD0"/>
+    <w:rsid w:val="00F22C4E"/>
     <w:rsid w:val="00F26D83"/>
     <w:rsid w:val="00F3039A"/>
     <w:rsid w:val="00F40787"/>
     <w:rsid w:val="00F56CAD"/>
+    <w:rsid w:val="00F57DFE"/>
     <w:rsid w:val="00F620FB"/>
     <w:rsid w:val="00F90A87"/>
     <w:rsid w:val="00F94A9B"/>
@@ -10062,26 +9976,6 @@
 </file>
 
 <file path=customXml/item1.xml><?xml version="1.0" encoding="utf-8"?>
-<p:properties xmlns:p="http://schemas.microsoft.com/office/2006/metadata/properties" xmlns:xsi="http://www.w3.org/2001/XMLSchema-instance">
-  <documentManagement>
-    <lcf76f155ced4ddcb4097134ff3c332f xmlns="1b4d0333-1b33-414c-b04a-1d69857a46e0">
-      <Terms xmlns="http://schemas.microsoft.com/office/infopath/2007/PartnerControls"/>
-    </lcf76f155ced4ddcb4097134ff3c332f>
-    <TaxCatchAll xmlns="0dfa6105-4e03-4582-a5b6-d40922f3c820" xsi:nil="true"/>
-  </documentManagement>
-</p:properties>
-</file>
-
-<file path=customXml/item2.xml><?xml version="1.0" encoding="utf-8"?>
-<?mso-contentType ?>
-<FormTemplates xmlns="http://schemas.microsoft.com/sharepoint/v3/contenttype/forms">
-  <Display>DocumentLibraryForm</Display>
-  <Edit>DocumentLibraryForm</Edit>
-  <New>DocumentLibraryForm</New>
-</FormTemplates>
-</file>
-
-<file path=customXml/item3.xml><?xml version="1.0" encoding="utf-8"?>
 <ct:contentTypeSchema xmlns:ct="http://schemas.microsoft.com/office/2006/metadata/contentType" xmlns:ma="http://schemas.microsoft.com/office/2006/metadata/properties/metaAttributes" ct:_="" ma:_="" ma:contentTypeName="Document" ma:contentTypeID="0x010100ABCDA13995A9524982B937E00F80E6E0" ma:contentTypeVersion="11" ma:contentTypeDescription="Create a new document." ma:contentTypeScope="" ma:versionID="4f6be1ed2e285541239abc9f913cda14">
   <xsd:schema xmlns:xsd="http://www.w3.org/2001/XMLSchema" xmlns:xs="http://www.w3.org/2001/XMLSchema" xmlns:p="http://schemas.microsoft.com/office/2006/metadata/properties" xmlns:ns2="1b4d0333-1b33-414c-b04a-1d69857a46e0" xmlns:ns3="0dfa6105-4e03-4582-a5b6-d40922f3c820" targetNamespace="http://schemas.microsoft.com/office/2006/metadata/properties" ma:root="true" ma:fieldsID="7792a18696d3e888f0fab05b54f3e11f" ns2:_="" ns3:_="">
     <xsd:import namespace="1b4d0333-1b33-414c-b04a-1d69857a46e0"/>
@@ -10276,30 +10170,31 @@
 </ct:contentTypeSchema>
 </file>
 
+<file path=customXml/item2.xml><?xml version="1.0" encoding="utf-8"?>
+<?mso-contentType ?>
+<FormTemplates xmlns="http://schemas.microsoft.com/sharepoint/v3/contenttype/forms">
+  <Display>DocumentLibraryForm</Display>
+  <Edit>DocumentLibraryForm</Edit>
+  <New>DocumentLibraryForm</New>
+</FormTemplates>
+</file>
+
+<file path=customXml/item3.xml><?xml version="1.0" encoding="utf-8"?>
+<p:properties xmlns:p="http://schemas.microsoft.com/office/2006/metadata/properties" xmlns:xsi="http://www.w3.org/2001/XMLSchema-instance">
+  <documentManagement>
+    <lcf76f155ced4ddcb4097134ff3c332f xmlns="1b4d0333-1b33-414c-b04a-1d69857a46e0">
+      <Terms xmlns="http://schemas.microsoft.com/office/infopath/2007/PartnerControls"/>
+    </lcf76f155ced4ddcb4097134ff3c332f>
+    <TaxCatchAll xmlns="0dfa6105-4e03-4582-a5b6-d40922f3c820" xsi:nil="true"/>
+  </documentManagement>
+</p:properties>
+</file>
+
 <file path=customXml/item4.xml><?xml version="1.0" encoding="utf-8"?>
 <b:Sources xmlns:b="http://schemas.openxmlformats.org/officeDocument/2006/bibliography" xmlns="http://schemas.openxmlformats.org/officeDocument/2006/bibliography" SelectedStyle="\APA.XSL" StyleName="APA Fifth Edition"/>
 </file>
 
 <file path=customXml/itemProps1.xml><?xml version="1.0" encoding="utf-8"?>
-<ds:datastoreItem xmlns:ds="http://schemas.openxmlformats.org/officeDocument/2006/customXml" ds:itemID="{1FFB5C50-97DC-4C4E-BA6F-D6A1D523E164}">
-  <ds:schemaRefs>
-    <ds:schemaRef ds:uri="http://schemas.microsoft.com/office/2006/metadata/properties"/>
-    <ds:schemaRef ds:uri="1b4d0333-1b33-414c-b04a-1d69857a46e0"/>
-    <ds:schemaRef ds:uri="http://schemas.microsoft.com/office/infopath/2007/PartnerControls"/>
-    <ds:schemaRef ds:uri="0dfa6105-4e03-4582-a5b6-d40922f3c820"/>
-  </ds:schemaRefs>
-</ds:datastoreItem>
-</file>
-
-<file path=customXml/itemProps2.xml><?xml version="1.0" encoding="utf-8"?>
-<ds:datastoreItem xmlns:ds="http://schemas.openxmlformats.org/officeDocument/2006/customXml" ds:itemID="{38272512-EDBD-44DE-BD38-00BAB3D04656}">
-  <ds:schemaRefs>
-    <ds:schemaRef ds:uri="http://schemas.microsoft.com/sharepoint/v3/contenttype/forms"/>
-  </ds:schemaRefs>
-</ds:datastoreItem>
-</file>
-
-<file path=customXml/itemProps3.xml><?xml version="1.0" encoding="utf-8"?>
 <ds:datastoreItem xmlns:ds="http://schemas.openxmlformats.org/officeDocument/2006/customXml" ds:itemID="{EFA809F1-573C-4050-A95C-9416DD01CC60}">
   <ds:schemaRefs>
     <ds:schemaRef ds:uri="http://schemas.microsoft.com/office/2006/metadata/contentType"/>
@@ -10318,6 +10213,25 @@
 </ds:datastoreItem>
 </file>
 
+<file path=customXml/itemProps2.xml><?xml version="1.0" encoding="utf-8"?>
+<ds:datastoreItem xmlns:ds="http://schemas.openxmlformats.org/officeDocument/2006/customXml" ds:itemID="{38272512-EDBD-44DE-BD38-00BAB3D04656}">
+  <ds:schemaRefs>
+    <ds:schemaRef ds:uri="http://schemas.microsoft.com/sharepoint/v3/contenttype/forms"/>
+  </ds:schemaRefs>
+</ds:datastoreItem>
+</file>
+
+<file path=customXml/itemProps3.xml><?xml version="1.0" encoding="utf-8"?>
+<ds:datastoreItem xmlns:ds="http://schemas.openxmlformats.org/officeDocument/2006/customXml" ds:itemID="{1FFB5C50-97DC-4C4E-BA6F-D6A1D523E164}">
+  <ds:schemaRefs>
+    <ds:schemaRef ds:uri="http://schemas.microsoft.com/office/2006/metadata/properties"/>
+    <ds:schemaRef ds:uri="1b4d0333-1b33-414c-b04a-1d69857a46e0"/>
+    <ds:schemaRef ds:uri="http://schemas.microsoft.com/office/infopath/2007/PartnerControls"/>
+    <ds:schemaRef ds:uri="0dfa6105-4e03-4582-a5b6-d40922f3c820"/>
+  </ds:schemaRefs>
+</ds:datastoreItem>
+</file>
+
 <file path=customXml/itemProps4.xml><?xml version="1.0" encoding="utf-8"?>
 <ds:datastoreItem xmlns:ds="http://schemas.openxmlformats.org/officeDocument/2006/customXml" ds:itemID="{F0BBAED5-B99B-4F2F-91D0-906FF495A8D2}">
   <ds:schemaRefs>

</xml_diff>